<commit_message>
Update docs to match latest code
Co-Authored-By: Claude Opus 5.5 <noreply@anthropic.com>
</commit_message>
<xml_diff>
--- a/Project poe.docx
+++ b/Project poe.docx
@@ -1584,7 +1584,7 @@
                 <w:color w:val="1f1f1f"/>
                 <w:rtl w:val="0"/>
               </w:rPr>
-              <w:t xml:space="preserve">โค้ดเสร็จ (affix 3 แบบ + อินเวนทอรี) รอทดสอบใน Studio</w:t>
+              <w:t xml:space="preserve">โค้ดเสร็จ (affix 3 แบบ + อินเวนทอรี + ช่องสวมใส่ 9 ช่อง) รอทดสอบใน Studio</w:t>
             </w:r>
           </w:p>
         </w:tc>
@@ -2084,7 +2084,7 @@
                 <w:color w:val="1f1f1f"/>
                 <w:rtl w:val="0"/>
               </w:rPr>
-              <w:t xml:space="preserve">ด่าน DungeonMap + ประตูวาร์ป + Minimap (B/M) เสร็จแล้ว กำลังทดสอบใน Studio</w:t>
+              <w:t xml:space="preserve">ด่าน DungeonMap + ประตูวาร์ป + มินิแมพ + หน้าตั้งค่าเสร็จแล้ว กำลังทดสอบใน Studio และยังต้องปรับบาลานซ์</w:t>
             </w:r>
           </w:p>
         </w:tc>
@@ -3713,6 +3713,30 @@
           <w:rtl w:val="0"/>
         </w:rPr>
         <w:t xml:space="preserve">[x] ทำปุ่มรองรับมือถือ (ปุ่มสกิล/กระเป๋า/มินิแมพ)</w:t>
+      </w:r>
+    </w:p>
+    <w:p>
+      <w:pPr>
+        <w:numPr>
+          <w:ilvl w:val="1"/>
+          <w:numId w:val="3"/>
+        </w:numPr>
+        <w:pBdr>
+          <w:top w:color="auto" w:space="0" w:sz="0" w:val="none"/>
+          <w:bottom w:color="auto" w:space="0" w:sz="0" w:val="none"/>
+          <w:right w:color="auto" w:space="0" w:sz="0" w:val="none"/>
+          <w:between w:color="auto" w:space="0" w:sz="0" w:val="none"/>
+        </w:pBdr>
+        <w:spacing w:after="0" w:afterAutospacing="0" w:lineRule="auto"/>
+        <w:ind w:left="1440" w:hanging="360"/>
+      </w:pPr>
+      <w:r>
+        <w:rPr>
+          <w:rFonts w:ascii="Arial Unicode MS" w:cs="Arial Unicode MS" w:eastAsia="Arial Unicode MS" w:hAnsi="Arial Unicode MS"/>
+          <w:color w:val="1f1f1f"/>
+          <w:rtl w:val="0"/>
+        </w:rPr>
+        <w:t xml:space="preserve">[ ] ทดสอบบนมือถือจำลอง</w:t>
       </w:r>
     </w:p>
     <w:p>

</xml_diff>

<commit_message>
Replace jump with dodge roll and stop enemies charging unseen
Co-Authored-By: Claude Opus 5.5 <noreply@anthropic.com>
</commit_message>
<xml_diff>
--- a/Project poe.docx
+++ b/Project poe.docx
@@ -122,7 +122,7 @@
           <w:color w:val="1f1f1f"/>
           <w:rtl w:val="0"/>
         </w:rPr>
-        <w:t xml:space="preserve"> เฟส 5 (โค้ดเฟส 1-5 เสร็จแล้ว รอทดสอบใน Studio)</w:t>
+        <w:t xml:space="preserve"> เฟส 6 (เฟส 1-5 เสร็จแล้ว ปัญหาจากเทสรอบแรกแก้ครบ)</w:t>
       </w:r>
     </w:p>
     <w:p>
@@ -190,7 +190,7 @@
           <w:color w:val="1f1f1f"/>
           <w:rtl w:val="0"/>
         </w:rPr>
-        <w:t xml:space="preserve"> ทดสอบเล่นครบลูปใน Studio: เข้าด่านผ่านประตูวาร์ป สู้ Grunt และบอส Brute เก็บของ ใส่ของ และเลเวลอัป</w:t>
+        <w:t xml:space="preserve"> หาคนลองเล่น 3-5 คน</w:t>
       </w:r>
     </w:p>
     <w:p>
@@ -224,7 +224,7 @@
           <w:color w:val="1f1f1f"/>
           <w:rtl w:val="0"/>
         </w:rPr>
-        <w:t xml:space="preserve"> ปรับบาลานซ์ตามผลเทส ทดสอบบันทึกข้อมูลในเพลสที่ publish แล้ว จากนั้นเริ่มเฟส 6 (ให้คนลองเล่น)</w:t>
+        <w:t xml:space="preserve"> ดูว่าคนลองเล่นติดตรงไหน จดบั๊กและจุดที่ไม่สนุก แล้วแก้เฉพาะปัญหาที่เจอซ้ำหลายคน</w:t>
       </w:r>
     </w:p>
     <w:p>
@@ -963,7 +963,7 @@
                 <w:color w:val="1f1f1f"/>
                 <w:rtl w:val="0"/>
               </w:rPr>
-              <w:t xml:space="preserve">กำลังทำ</w:t>
+              <w:t xml:space="preserve">เสร็จ</w:t>
             </w:r>
           </w:p>
         </w:tc>
@@ -1043,7 +1043,7 @@
                 <w:color w:val="1f1f1f"/>
                 <w:rtl w:val="0"/>
               </w:rPr>
-              <w:t xml:space="preserve">-</w:t>
+              <w:t xml:space="preserve">30/10</w:t>
             </w:r>
           </w:p>
         </w:tc>
@@ -1084,7 +1084,7 @@
                 <w:color w:val="1f1f1f"/>
                 <w:rtl w:val="0"/>
               </w:rPr>
-              <w:t xml:space="preserve">โค้ดเสร็จ เหลือทดสอบบนมือถือจำลอง</w:t>
+              <w:t xml:space="preserve">เทสผ่าน (รวมมือถือจำลอง) + กลิ้งหลบแทนกระโดด</w:t>
             </w:r>
           </w:p>
         </w:tc>
@@ -1213,7 +1213,7 @@
                 <w:color w:val="1f1f1f"/>
                 <w:rtl w:val="0"/>
               </w:rPr>
-              <w:t xml:space="preserve">กำลังทำ</w:t>
+              <w:t xml:space="preserve">เสร็จ</w:t>
             </w:r>
           </w:p>
         </w:tc>
@@ -1293,7 +1293,7 @@
                 <w:color w:val="1f1f1f"/>
                 <w:rtl w:val="0"/>
               </w:rPr>
-              <w:t xml:space="preserve">-</w:t>
+              <w:t xml:space="preserve">30/10</w:t>
             </w:r>
           </w:p>
         </w:tc>
@@ -1334,7 +1334,7 @@
                 <w:color w:val="1f1f1f"/>
                 <w:rtl w:val="0"/>
               </w:rPr>
-              <w:t xml:space="preserve">โค้ดเสร็จ (Grunt + บอส Brute) รอทดสอบใน Studio</w:t>
+              <w:t xml:space="preserve">เทสผ่าน (Grunt + บอส Brute)</w:t>
             </w:r>
           </w:p>
         </w:tc>
@@ -1463,7 +1463,7 @@
                 <w:color w:val="1f1f1f"/>
                 <w:rtl w:val="0"/>
               </w:rPr>
-              <w:t xml:space="preserve">กำลังทำ</w:t>
+              <w:t xml:space="preserve">เสร็จ</w:t>
             </w:r>
           </w:p>
         </w:tc>
@@ -1543,7 +1543,7 @@
                 <w:color w:val="1f1f1f"/>
                 <w:rtl w:val="0"/>
               </w:rPr>
-              <w:t xml:space="preserve">-</w:t>
+              <w:t xml:space="preserve">30/10</w:t>
             </w:r>
           </w:p>
         </w:tc>
@@ -1584,7 +1584,7 @@
                 <w:color w:val="1f1f1f"/>
                 <w:rtl w:val="0"/>
               </w:rPr>
-              <w:t xml:space="preserve">โค้ดเสร็จ (affix 3 แบบ + อินเวนทอรี + ช่องสวมใส่ 9 ช่อง) รอทดสอบใน Studio</w:t>
+              <w:t xml:space="preserve">เทสผ่าน (affix 3 แบบ + อินเวนทอรี + ช่องสวมใส่ 9 ช่อง)</w:t>
             </w:r>
           </w:p>
         </w:tc>
@@ -1713,7 +1713,7 @@
                 <w:color w:val="1f1f1f"/>
                 <w:rtl w:val="0"/>
               </w:rPr>
-              <w:t xml:space="preserve">กำลังทำ</w:t>
+              <w:t xml:space="preserve">เสร็จ</w:t>
             </w:r>
           </w:p>
         </w:tc>
@@ -1793,7 +1793,7 @@
                 <w:color w:val="1f1f1f"/>
                 <w:rtl w:val="0"/>
               </w:rPr>
-              <w:t xml:space="preserve">-</w:t>
+              <w:t xml:space="preserve">30/10</w:t>
             </w:r>
           </w:p>
         </w:tc>
@@ -1834,7 +1834,7 @@
                 <w:color w:val="1f1f1f"/>
                 <w:rtl w:val="0"/>
               </w:rPr>
-              <w:t xml:space="preserve">โค้ดเสร็จ ต้องทดสอบในเพลสที่ publish แล้ว (game.rbxl บันทึกไม่ได้)</w:t>
+              <w:t xml:space="preserve">เทสเซฟผ่าน (ต้องเทสในเพลสที่ publish แล้ว game.rbxl บันทึกไม่ได้)</w:t>
             </w:r>
           </w:p>
         </w:tc>
@@ -1963,7 +1963,7 @@
                 <w:color w:val="1f1f1f"/>
                 <w:rtl w:val="0"/>
               </w:rPr>
-              <w:t xml:space="preserve">กำลังทำ</w:t>
+              <w:t xml:space="preserve">เสร็จ</w:t>
             </w:r>
           </w:p>
         </w:tc>
@@ -2043,7 +2043,7 @@
                 <w:color w:val="1f1f1f"/>
                 <w:rtl w:val="0"/>
               </w:rPr>
-              <w:t xml:space="preserve">-</w:t>
+              <w:t xml:space="preserve">30/10</w:t>
             </w:r>
           </w:p>
         </w:tc>
@@ -2084,7 +2084,7 @@
                 <w:color w:val="1f1f1f"/>
                 <w:rtl w:val="0"/>
               </w:rPr>
-              <w:t xml:space="preserve">ด่าน DungeonMap + ประตูวาร์ป + มินิแมพ + หน้าตั้งค่าเสร็จแล้ว กำลังทดสอบใน Studio และยังต้องปรับบาลานซ์</w:t>
+              <w:t xml:space="preserve">เทสผ่านครบลูป (ด่าน DungeonMap + ประตูวาร์ป + มินิแมพ + หน้าตั้งค่า)</w:t>
             </w:r>
           </w:p>
         </w:tc>
@@ -2213,7 +2213,47 @@
                 <w:color w:val="1f1f1f"/>
                 <w:rtl w:val="0"/>
               </w:rPr>
-              <w:t xml:space="preserve">ยังไม่เริ่ม</w:t>
+              <w:t xml:space="preserve">กำลังทำ</w:t>
+            </w:r>
+          </w:p>
+        </w:tc>
+        <w:tc>
+          <w:tcPr>
+            <w:tcBorders>
+              <w:top w:color="c4c7c5" w:space="0" w:sz="7" w:val="single"/>
+              <w:left w:color="c4c7c5" w:space="0" w:sz="7" w:val="single"/>
+              <w:bottom w:color="c4c7c5" w:space="0" w:sz="7" w:val="single"/>
+              <w:right w:color="c4c7c5" w:space="0" w:sz="7" w:val="single"/>
+            </w:tcBorders>
+            <w:shd w:fill="f8fafd" w:val="clear"/>
+            <w:tcMar>
+              <w:top w:w="120.0" w:type="dxa"/>
+              <w:left w:w="180.0" w:type="dxa"/>
+              <w:bottom w:w="120.0" w:type="dxa"/>
+              <w:right w:w="180.0" w:type="dxa"/>
+            </w:tcMar>
+            <w:vAlign w:val="top"/>
+          </w:tcPr>
+          <w:p>
+            <w:pPr>
+              <w:pBdr>
+                <w:top w:color="auto" w:space="0" w:sz="0" w:val="none"/>
+                <w:left w:color="auto" w:space="0" w:sz="0" w:val="none"/>
+                <w:bottom w:color="auto" w:space="0" w:sz="0" w:val="none"/>
+                <w:right w:color="auto" w:space="0" w:sz="0" w:val="none"/>
+                <w:between w:color="auto" w:space="0" w:sz="0" w:val="none"/>
+              </w:pBdr>
+              <w:spacing w:after="480" w:lineRule="auto"/>
+              <w:rPr>
+                <w:color w:val="1f1f1f"/>
+              </w:rPr>
+            </w:pPr>
+            <w:r>
+              <w:rPr>
+                <w:color w:val="1f1f1f"/>
+                <w:rtl w:val="0"/>
+              </w:rPr>
+              <w:t xml:space="preserve">30/10</w:t>
             </w:r>
           </w:p>
         </w:tc>
@@ -2293,47 +2333,7 @@
                 <w:color w:val="1f1f1f"/>
                 <w:rtl w:val="0"/>
               </w:rPr>
-              <w:t xml:space="preserve">-</w:t>
-            </w:r>
-          </w:p>
-        </w:tc>
-        <w:tc>
-          <w:tcPr>
-            <w:tcBorders>
-              <w:top w:color="c4c7c5" w:space="0" w:sz="7" w:val="single"/>
-              <w:left w:color="c4c7c5" w:space="0" w:sz="7" w:val="single"/>
-              <w:bottom w:color="c4c7c5" w:space="0" w:sz="7" w:val="single"/>
-              <w:right w:color="c4c7c5" w:space="0" w:sz="7" w:val="single"/>
-            </w:tcBorders>
-            <w:shd w:fill="f8fafd" w:val="clear"/>
-            <w:tcMar>
-              <w:top w:w="120.0" w:type="dxa"/>
-              <w:left w:w="180.0" w:type="dxa"/>
-              <w:bottom w:w="120.0" w:type="dxa"/>
-              <w:right w:w="180.0" w:type="dxa"/>
-            </w:tcMar>
-            <w:vAlign w:val="top"/>
-          </w:tcPr>
-          <w:p>
-            <w:pPr>
-              <w:pBdr>
-                <w:top w:color="auto" w:space="0" w:sz="0" w:val="none"/>
-                <w:left w:color="auto" w:space="0" w:sz="0" w:val="none"/>
-                <w:bottom w:color="auto" w:space="0" w:sz="0" w:val="none"/>
-                <w:right w:color="auto" w:space="0" w:sz="0" w:val="none"/>
-                <w:between w:color="auto" w:space="0" w:sz="0" w:val="none"/>
-              </w:pBdr>
-              <w:spacing w:after="480" w:lineRule="auto"/>
-              <w:rPr>
-                <w:color w:val="1f1f1f"/>
-              </w:rPr>
-            </w:pPr>
-            <w:r>
-              <w:rPr>
-                <w:color w:val="1f1f1f"/>
-                <w:rtl w:val="0"/>
-              </w:rPr>
-              <w:t xml:space="preserve">-</w:t>
+              <w:t xml:space="preserve">เทสรอบแรก: ศัตรูวาปมาตีตอนเจอครั้งแรก, เปลี่ยนกระโดดเป็นกลิ้งหลบ (Dodge) แก้แล้ว เทสซ้ำผ่าน</w:t>
             </w:r>
           </w:p>
         </w:tc>
@@ -3736,7 +3736,7 @@
           <w:color w:val="1f1f1f"/>
           <w:rtl w:val="0"/>
         </w:rPr>
-        <w:t xml:space="preserve">[ ] ทดสอบบนมือถือจำลอง</w:t>
+        <w:t xml:space="preserve">[x] ทดสอบบนมือถือจำลอง</w:t>
       </w:r>
     </w:p>
     <w:p>
@@ -4537,7 +4537,7 @@
           <w:color w:val="1f1f1f"/>
           <w:rtl w:val="0"/>
         </w:rPr>
-        <w:t xml:space="preserve">[ ] ทดสอบเข้าออกหลายรอบ</w:t>
+        <w:t xml:space="preserve">[x] ทดสอบเข้าออกหลายรอบ</w:t>
       </w:r>
     </w:p>
     <w:p>
@@ -4730,7 +4730,7 @@
           <w:color w:val="1f1f1f"/>
           <w:rtl w:val="0"/>
         </w:rPr>
-        <w:t xml:space="preserve">[ ] ปรับบาลานซ์ดาเมจ เลือด และอัตราดรอปคร่าวๆ</w:t>
+        <w:t xml:space="preserve">[x] ปรับบาลานซ์ดาเมจ เลือด และอัตราดรอปคร่าวๆ</w:t>
       </w:r>
     </w:p>
     <w:p>

</xml_diff>

<commit_message>
Add life/mana flasks, mana and energy shield
Co-Authored-By: Claude Opus 5.5 <noreply@anthropic.com>
</commit_message>
<xml_diff>
--- a/Project poe.docx
+++ b/Project poe.docx
@@ -122,7 +122,7 @@
           <w:color w:val="1f1f1f"/>
           <w:rtl w:val="0"/>
         </w:rPr>
-        <w:t xml:space="preserve"> เฟส 6 (เฟส 1-5 เสร็จแล้ว ปัญหาจากเทสรอบแรกแก้ครบ)</w:t>
+        <w:t xml:space="preserve"> เฟส 7+ (เฟส 1-6 เสร็จแล้ว ได้เวอร์ชันแรกครบตามขอบเขต MVP)</w:t>
       </w:r>
     </w:p>
     <w:p>
@@ -190,7 +190,7 @@
           <w:color w:val="1f1f1f"/>
           <w:rtl w:val="0"/>
         </w:rPr>
-        <w:t xml:space="preserve"> หาคนลองเล่น 3-5 คน</w:t>
+        <w:t xml:space="preserve"> ขวดยาเลือด/มานา, แถบมานา, Energy Shield + affix ES (โค้ดเสร็จ รอเทสใน Studio)</w:t>
       </w:r>
     </w:p>
     <w:p>
@@ -224,7 +224,7 @@
           <w:color w:val="1f1f1f"/>
           <w:rtl w:val="0"/>
         </w:rPr>
-        <w:t xml:space="preserve"> ดูว่าคนลองเล่นติดตรงไหน จดบั๊กและจุดที่ไม่สนุก แล้วแก้เฉพาะปัญหาที่เจอซ้ำหลายคน</w:t>
+        <w:t xml:space="preserve"> เทสขวดยา มานา และ ES ใน Studio แล้วหยิบไอเดียถัดไปจากหัวข้อ 7. ไว้ทีหลัง (ธาตุ + สถานะผิดปกติ) ให้ทดสอบเล่นได้ทุก 1-2 สัปดาห์</w:t>
       </w:r>
     </w:p>
     <w:p>
@@ -2213,7 +2213,7 @@
                 <w:color w:val="1f1f1f"/>
                 <w:rtl w:val="0"/>
               </w:rPr>
-              <w:t xml:space="preserve">กำลังทำ</w:t>
+              <w:t xml:space="preserve">เสร็จ</w:t>
             </w:r>
           </w:p>
         </w:tc>
@@ -2293,7 +2293,7 @@
                 <w:color w:val="1f1f1f"/>
                 <w:rtl w:val="0"/>
               </w:rPr>
-              <w:t xml:space="preserve">-</w:t>
+              <w:t xml:space="preserve">30/10</w:t>
             </w:r>
           </w:p>
         </w:tc>
@@ -2462,7 +2462,47 @@
                 <w:color w:val="1f1f1f"/>
                 <w:rtl w:val="0"/>
               </w:rPr>
-              <w:t xml:space="preserve">ยังไม่เริ่ม</w:t>
+              <w:t xml:space="preserve">กำลังทำ</w:t>
+            </w:r>
+          </w:p>
+        </w:tc>
+        <w:tc>
+          <w:tcPr>
+            <w:tcBorders>
+              <w:top w:color="c4c7c5" w:space="0" w:sz="7" w:val="single"/>
+              <w:left w:color="c4c7c5" w:space="0" w:sz="7" w:val="single"/>
+              <w:bottom w:color="c4c7c5" w:space="0" w:sz="7" w:val="single"/>
+              <w:right w:color="c4c7c5" w:space="0" w:sz="7" w:val="single"/>
+            </w:tcBorders>
+            <w:shd w:fill="f8fafd" w:val="clear"/>
+            <w:tcMar>
+              <w:top w:w="120.0" w:type="dxa"/>
+              <w:left w:w="180.0" w:type="dxa"/>
+              <w:bottom w:w="120.0" w:type="dxa"/>
+              <w:right w:w="180.0" w:type="dxa"/>
+            </w:tcMar>
+            <w:vAlign w:val="top"/>
+          </w:tcPr>
+          <w:p>
+            <w:pPr>
+              <w:pBdr>
+                <w:top w:color="auto" w:space="0" w:sz="0" w:val="none"/>
+                <w:left w:color="auto" w:space="0" w:sz="0" w:val="none"/>
+                <w:bottom w:color="auto" w:space="0" w:sz="0" w:val="none"/>
+                <w:right w:color="auto" w:space="0" w:sz="0" w:val="none"/>
+                <w:between w:color="auto" w:space="0" w:sz="0" w:val="none"/>
+              </w:pBdr>
+              <w:spacing w:after="480" w:lineRule="auto"/>
+              <w:rPr>
+                <w:color w:val="1f1f1f"/>
+              </w:rPr>
+            </w:pPr>
+            <w:r>
+              <w:rPr>
+                <w:color w:val="1f1f1f"/>
+                <w:rtl w:val="0"/>
+              </w:rPr>
+              <w:t xml:space="preserve">30/10</w:t>
             </w:r>
           </w:p>
         </w:tc>
@@ -2542,47 +2582,7 @@
                 <w:color w:val="1f1f1f"/>
                 <w:rtl w:val="0"/>
               </w:rPr>
-              <w:t xml:space="preserve">-</w:t>
-            </w:r>
-          </w:p>
-        </w:tc>
-        <w:tc>
-          <w:tcPr>
-            <w:tcBorders>
-              <w:top w:color="c4c7c5" w:space="0" w:sz="7" w:val="single"/>
-              <w:left w:color="c4c7c5" w:space="0" w:sz="7" w:val="single"/>
-              <w:bottom w:color="c4c7c5" w:space="0" w:sz="7" w:val="single"/>
-              <w:right w:color="c4c7c5" w:space="0" w:sz="7" w:val="single"/>
-            </w:tcBorders>
-            <w:shd w:fill="f8fafd" w:val="clear"/>
-            <w:tcMar>
-              <w:top w:w="120.0" w:type="dxa"/>
-              <w:left w:w="180.0" w:type="dxa"/>
-              <w:bottom w:w="120.0" w:type="dxa"/>
-              <w:right w:w="180.0" w:type="dxa"/>
-            </w:tcMar>
-            <w:vAlign w:val="top"/>
-          </w:tcPr>
-          <w:p>
-            <w:pPr>
-              <w:pBdr>
-                <w:top w:color="auto" w:space="0" w:sz="0" w:val="none"/>
-                <w:left w:color="auto" w:space="0" w:sz="0" w:val="none"/>
-                <w:bottom w:color="auto" w:space="0" w:sz="0" w:val="none"/>
-                <w:right w:color="auto" w:space="0" w:sz="0" w:val="none"/>
-                <w:between w:color="auto" w:space="0" w:sz="0" w:val="none"/>
-              </w:pBdr>
-              <w:spacing w:after="480" w:lineRule="auto"/>
-              <w:rPr>
-                <w:color w:val="1f1f1f"/>
-              </w:rPr>
-            </w:pPr>
-            <w:r>
-              <w:rPr>
-                <w:color w:val="1f1f1f"/>
-                <w:rtl w:val="0"/>
-              </w:rPr>
-              <w:t xml:space="preserve">-</w:t>
+              <w:t xml:space="preserve">ขวดยาเลือด/มานา + มานา + Energy Shield (โค้ดเสร็จ รอเทส)</w:t>
             </w:r>
           </w:p>
         </w:tc>
@@ -4899,7 +4899,7 @@
           <w:color w:val="1f1f1f"/>
           <w:rtl w:val="0"/>
         </w:rPr>
-        <w:t xml:space="preserve">[ ] หาคนลอง 3-5 คน</w:t>
+        <w:t xml:space="preserve">[x] หาคนลอง 3-5 คน</w:t>
       </w:r>
     </w:p>
     <w:p>
@@ -4923,7 +4923,7 @@
           <w:color w:val="1f1f1f"/>
           <w:rtl w:val="0"/>
         </w:rPr>
-        <w:t xml:space="preserve">[ ] ดูว่าเขาติดตรงไหนโดยไม่ช่วยพูด</w:t>
+        <w:t xml:space="preserve">[x] ดูว่าเขาติดตรงไหนโดยไม่ช่วยพูด</w:t>
       </w:r>
     </w:p>
     <w:p>
@@ -4947,7 +4947,7 @@
           <w:color w:val="1f1f1f"/>
           <w:rtl w:val="0"/>
         </w:rPr>
-        <w:t xml:space="preserve">[ ] จดบั๊กและจุดที่ไม่สนุก</w:t>
+        <w:t xml:space="preserve">[x] จดบั๊กและจุดที่ไม่สนุก</w:t>
       </w:r>
     </w:p>
     <w:p>
@@ -4971,7 +4971,7 @@
           <w:color w:val="1f1f1f"/>
           <w:rtl w:val="0"/>
         </w:rPr>
-        <w:t xml:space="preserve">[ ] เลือกแก้เฉพาะปัญหาที่เจอซ้ำหลายคน</w:t>
+        <w:t xml:space="preserve">[x] เลือกแก้เฉพาะปัญหาที่เจอซ้ำหลายคน</w:t>
       </w:r>
     </w:p>
     <w:p>
@@ -6111,10 +6111,20 @@
       <w:r>
         <w:rPr>
           <w:rFonts w:ascii="Arial Unicode MS" w:cs="Arial Unicode MS" w:eastAsia="Arial Unicode MS" w:hAnsi="Arial Unicode MS"/>
-          <w:color w:val="1f1f1f"/>
-          <w:rtl w:val="0"/>
-        </w:rPr>
-        <w:t xml:space="preserve">(รอใส่ไอเดีย)</w:t>
+          <w:b w:val="1"/>
+          <w:bCs w:val="1"/>
+          <w:color w:val="1f1f1f"/>
+          <w:rtl w:val="0"/>
+        </w:rPr>
+        <w:t xml:space="preserve">ขวดยาเลือด:</w:t>
+      </w:r>
+      <w:r>
+        <w:rPr>
+          <w:rFonts w:ascii="Arial Unicode MS" w:cs="Arial Unicode MS" w:eastAsia="Arial Unicode MS" w:hAnsi="Arial Unicode MS"/>
+          <w:color w:val="1f1f1f"/>
+          <w:rtl w:val="0"/>
+        </w:rPr>
+        <w:t xml:space="preserve"> เติมเองตอนฆ่าศัตรู กดใช้ได้ทั้ง PC และมือถือ ใช้คู่กับกลิ้งหลบที่ทำแล้วในเฟส 6 (กำลังทำในเฟส 7 พร้อมขวดมานา)</w:t>
       </w:r>
     </w:p>
     <w:p>
@@ -6129,16 +6139,196 @@
           <w:right w:color="auto" w:space="0" w:sz="0" w:val="none"/>
           <w:between w:color="auto" w:space="0" w:sz="0" w:val="none"/>
         </w:pBdr>
-        <w:spacing w:after="360" w:lineRule="auto"/>
+        <w:spacing w:after="0" w:afterAutospacing="0" w:lineRule="auto"/>
         <w:ind w:left="720" w:hanging="360"/>
       </w:pPr>
       <w:r>
         <w:rPr>
           <w:rFonts w:ascii="Arial Unicode MS" w:cs="Arial Unicode MS" w:eastAsia="Arial Unicode MS" w:hAnsi="Arial Unicode MS"/>
-          <w:color w:val="1f1f1f"/>
-          <w:rtl w:val="0"/>
-        </w:rPr>
-        <w:t xml:space="preserve">(รอใส่ไอเดีย)</w:t>
+          <w:b w:val="1"/>
+          <w:bCs w:val="1"/>
+          <w:color w:val="1f1f1f"/>
+          <w:rtl w:val="0"/>
+        </w:rPr>
+        <w:t xml:space="preserve">ธาตุ + สถานะผิดปกติ:</w:t>
+      </w:r>
+      <w:r>
+        <w:rPr>
+          <w:rFonts w:ascii="Arial Unicode MS" w:cs="Arial Unicode MS" w:eastAsia="Arial Unicode MS" w:hAnsi="Arial Unicode MS"/>
+          <w:color w:val="1f1f1f"/>
+          <w:rtl w:val="0"/>
+        </w:rPr>
+        <w:t xml:space="preserve"> ไฟทำให้ติดไฟ น้ำแข็งทำให้ช้าหรือแข็ง สายฟ้าทำให้รับดาเมจเพิ่ม และมี affix ค่าต้านทาน เป็นฐานของรูน หินคราฟต์ และแผ่นศิลา</w:t>
+      </w:r>
+    </w:p>
+    <w:p>
+      <w:pPr>
+        <w:numPr>
+          <w:ilvl w:val="0"/>
+          <w:numId w:val="12"/>
+        </w:numPr>
+        <w:pBdr>
+          <w:top w:color="auto" w:space="0" w:sz="0" w:val="none"/>
+          <w:bottom w:color="auto" w:space="0" w:sz="0" w:val="none"/>
+          <w:right w:color="auto" w:space="0" w:sz="0" w:val="none"/>
+          <w:between w:color="auto" w:space="0" w:sz="0" w:val="none"/>
+        </w:pBdr>
+        <w:spacing w:after="0" w:afterAutospacing="0" w:lineRule="auto"/>
+        <w:ind w:left="720" w:hanging="360"/>
+      </w:pPr>
+      <w:r>
+        <w:rPr>
+          <w:rFonts w:ascii="Arial Unicode MS" w:cs="Arial Unicode MS" w:eastAsia="Arial Unicode MS" w:hAnsi="Arial Unicode MS"/>
+          <w:b w:val="1"/>
+          <w:bCs w:val="1"/>
+          <w:color w:val="1f1f1f"/>
+          <w:rtl w:val="0"/>
+        </w:rPr>
+        <w:t xml:space="preserve">รูนสลักหิน (ระบบแต่งสกิล):</w:t>
+      </w:r>
+      <w:r>
+        <w:rPr>
+          <w:rFonts w:ascii="Arial Unicode MS" w:cs="Arial Unicode MS" w:eastAsia="Arial Unicode MS" w:hAnsi="Arial Unicode MS"/>
+          <w:color w:val="1f1f1f"/>
+          <w:rtl w:val="0"/>
+        </w:rPr>
+        <w:t xml:space="preserve"> ใส่ในสกิลได้สกิลละ 2-3 อัน เช่น วงกว้างขึ้น แตกเป็น 3 ทิศ เปลี่ยนเป็นธาตุไฟ ฆ่าแล้วศพระเบิด ต้องมีระบบธาตุก่อน</w:t>
+      </w:r>
+    </w:p>
+    <w:p>
+      <w:pPr>
+        <w:numPr>
+          <w:ilvl w:val="0"/>
+          <w:numId w:val="12"/>
+        </w:numPr>
+        <w:pBdr>
+          <w:top w:color="auto" w:space="0" w:sz="0" w:val="none"/>
+          <w:bottom w:color="auto" w:space="0" w:sz="0" w:val="none"/>
+          <w:right w:color="auto" w:space="0" w:sz="0" w:val="none"/>
+          <w:between w:color="auto" w:space="0" w:sz="0" w:val="none"/>
+        </w:pBdr>
+        <w:spacing w:after="0" w:afterAutospacing="0" w:lineRule="auto"/>
+        <w:ind w:left="720" w:hanging="360"/>
+      </w:pPr>
+      <w:r>
+        <w:rPr>
+          <w:rFonts w:ascii="Arial Unicode MS" w:cs="Arial Unicode MS" w:eastAsia="Arial Unicode MS" w:hAnsi="Arial Unicode MS"/>
+          <w:b w:val="1"/>
+          <w:bCs w:val="1"/>
+          <w:color w:val="1f1f1f"/>
+          <w:rtl w:val="0"/>
+        </w:rPr>
+        <w:t xml:space="preserve">หินคราฟต์:</w:t>
+      </w:r>
+      <w:r>
+        <w:rPr>
+          <w:rFonts w:ascii="Arial Unicode MS" w:cs="Arial Unicode MS" w:eastAsia="Arial Unicode MS" w:hAnsi="Arial Unicode MS"/>
+          <w:color w:val="1f1f1f"/>
+          <w:rtl w:val="0"/>
+        </w:rPr>
+        <w:t xml:space="preserve"> ของดรอปที่ใช้กับไอเทม เช่น เพิ่ม affix, สุ่ม affix ใหม่, อัปความหายาก ต่อยอดจาก ItemData + Loot ที่มีอยู่</w:t>
+      </w:r>
+    </w:p>
+    <w:p>
+      <w:pPr>
+        <w:numPr>
+          <w:ilvl w:val="0"/>
+          <w:numId w:val="12"/>
+        </w:numPr>
+        <w:pBdr>
+          <w:top w:color="auto" w:space="0" w:sz="0" w:val="none"/>
+          <w:bottom w:color="auto" w:space="0" w:sz="0" w:val="none"/>
+          <w:right w:color="auto" w:space="0" w:sz="0" w:val="none"/>
+          <w:between w:color="auto" w:space="0" w:sz="0" w:val="none"/>
+        </w:pBdr>
+        <w:spacing w:after="0" w:afterAutospacing="0" w:lineRule="auto"/>
+        <w:ind w:left="720" w:hanging="360"/>
+      </w:pPr>
+      <w:r>
+        <w:rPr>
+          <w:rFonts w:ascii="Arial Unicode MS" w:cs="Arial Unicode MS" w:eastAsia="Arial Unicode MS" w:hAnsi="Arial Unicode MS"/>
+          <w:b w:val="1"/>
+          <w:bCs w:val="1"/>
+          <w:color w:val="1f1f1f"/>
+          <w:rtl w:val="0"/>
+        </w:rPr>
+        <w:t xml:space="preserve">แผ่นศิลา (endgame):</w:t>
+      </w:r>
+      <w:r>
+        <w:rPr>
+          <w:rFonts w:ascii="Arial Unicode MS" w:cs="Arial Unicode MS" w:eastAsia="Arial Unicode MS" w:hAnsi="Arial Unicode MS"/>
+          <w:color w:val="1f1f1f"/>
+          <w:rtl w:val="0"/>
+        </w:rPr>
+        <w:t xml:space="preserve"> ใส่ก่อนเข้าประตูด่าน มีม็อดสุ่ม เช่น ศัตรูเร็วขึ้น 20% แต่ดรอปเพิ่ม 30% ระดับยิ่งสูงยิ่งยากแต่ของยิ่งดี</w:t>
+      </w:r>
+    </w:p>
+    <w:p>
+      <w:pPr>
+        <w:numPr>
+          <w:ilvl w:val="0"/>
+          <w:numId w:val="12"/>
+        </w:numPr>
+        <w:pBdr>
+          <w:top w:color="auto" w:space="0" w:sz="0" w:val="none"/>
+          <w:bottom w:color="auto" w:space="0" w:sz="0" w:val="none"/>
+          <w:right w:color="auto" w:space="0" w:sz="0" w:val="none"/>
+          <w:between w:color="auto" w:space="0" w:sz="0" w:val="none"/>
+        </w:pBdr>
+        <w:spacing w:after="0" w:afterAutospacing="0" w:lineRule="auto"/>
+        <w:ind w:left="720" w:hanging="360"/>
+      </w:pPr>
+      <w:r>
+        <w:rPr>
+          <w:rFonts w:ascii="Arial Unicode MS" w:cs="Arial Unicode MS" w:eastAsia="Arial Unicode MS" w:hAnsi="Arial Unicode MS"/>
+          <w:b w:val="1"/>
+          <w:bCs w:val="1"/>
+          <w:color w:val="1f1f1f"/>
+          <w:rtl w:val="0"/>
+        </w:rPr>
+        <w:t xml:space="preserve">ผังพาสซีฟ + คลาส:</w:t>
+      </w:r>
+      <w:r>
+        <w:rPr>
+          <w:rFonts w:ascii="Arial Unicode MS" w:cs="Arial Unicode MS" w:eastAsia="Arial Unicode MS" w:hAnsi="Arial Unicode MS"/>
+          <w:color w:val="1f1f1f"/>
+          <w:rtl w:val="0"/>
+        </w:rPr>
+        <w:t xml:space="preserve"> เก็บไว้ท้ายสุด เพราะเป็นงานใหญ่ อยู่นอก MVP และทำบนจอมือถือยาก</w:t>
+      </w:r>
+    </w:p>
+    <w:p>
+      <w:pPr>
+        <w:numPr>
+          <w:ilvl w:val="0"/>
+          <w:numId w:val="12"/>
+        </w:numPr>
+        <w:pBdr>
+          <w:top w:color="auto" w:space="0" w:sz="0" w:val="none"/>
+          <w:bottom w:color="auto" w:space="0" w:sz="0" w:val="none"/>
+          <w:right w:color="auto" w:space="0" w:sz="0" w:val="none"/>
+          <w:between w:color="auto" w:space="0" w:sz="0" w:val="none"/>
+        </w:pBdr>
+        <w:spacing w:after="0" w:afterAutospacing="0" w:lineRule="auto"/>
+        <w:ind w:left="720" w:hanging="360"/>
+      </w:pPr>
+      <w:r>
+        <w:rPr>
+          <w:rFonts w:ascii="Arial Unicode MS" w:cs="Arial Unicode MS" w:eastAsia="Arial Unicode MS" w:hAnsi="Arial Unicode MS"/>
+          <w:b w:val="1"/>
+          <w:bCs w:val="1"/>
+          <w:color w:val="1f1f1f"/>
+          <w:rtl w:val="0"/>
+        </w:rPr>
+        <w:t xml:space="preserve">ข้อควรระวัง:</w:t>
+      </w:r>
+      <w:r>
+        <w:rPr>
+          <w:rFonts w:ascii="Arial Unicode MS" w:cs="Arial Unicode MS" w:eastAsia="Arial Unicode MS" w:hAnsi="Arial Unicode MS"/>
+          <w:color w:val="1f1f1f"/>
+          <w:rtl w:val="0"/>
+        </w:rPr>
+        <w:t xml:space="preserve"> ใช้ระบบแนวเดียวกับ PoE ได้ แต่ห้ามใช้ชื่อของเขา (Orb, Waystone, Atlas, ชื่อเจม/คลาส) เลย์เอาต์ผังพาสซีฟ ภาพ เสียง หรือตารางตัวเลข ให้ตั้งชื่อตามธีมหินของเกมเรา</w:t>
       </w:r>
     </w:p>
     <w:p>

</xml_diff>

<commit_message>
Add elements, ailments, resistances, stone runes and inventory hotkeys
Co-Authored-By: Claude Opus 5.5 <noreply@anthropic.com>
</commit_message>
<xml_diff>
--- a/Project poe.docx
+++ b/Project poe.docx
@@ -190,7 +190,7 @@
           <w:color w:val="1f1f1f"/>
           <w:rtl w:val="0"/>
         </w:rPr>
-        <w:t xml:space="preserve"> ขวดยาเลือด/มานา, แถบมานา, Energy Shield + affix ES (โค้ดเสร็จ รอเทสใน Studio)</w:t>
+        <w:t xml:space="preserve"> ขวดยาเลือด/มานา, แถบมานา, Energy Shield, ธาตุ + สถานะผิดปกติ + ค่าต้านทาน, คีย์ลัดกระเป๋า (Shift+คลิก สวมใส่, X ทิ้ง), รูนสลักหิน (โค้ดเสร็จ รอเทสใน Studio)</w:t>
       </w:r>
     </w:p>
     <w:p>
@@ -224,7 +224,7 @@
           <w:color w:val="1f1f1f"/>
           <w:rtl w:val="0"/>
         </w:rPr>
-        <w:t xml:space="preserve"> เทสขวดยา มานา และ ES ใน Studio แล้วหยิบไอเดียถัดไปจากหัวข้อ 7. ไว้ทีหลัง (ธาตุ + สถานะผิดปกติ) ให้ทดสอบเล่นได้ทุก 1-2 สัปดาห์</w:t>
+        <w:t xml:space="preserve"> เทสขวดยา มานา ES ธาตุ และรูนใน Studio แล้วหยิบไอเดียถัดไปจากหัวข้อ 7. ไว้ทีหลัง (หินคราฟต์) ให้ทดสอบเล่นได้ทุก 1-2 สัปดาห์</w:t>
       </w:r>
     </w:p>
     <w:p>
@@ -2582,7 +2582,7 @@
                 <w:color w:val="1f1f1f"/>
                 <w:rtl w:val="0"/>
               </w:rPr>
-              <w:t xml:space="preserve">ขวดยาเลือด/มานา + มานา + Energy Shield (โค้ดเสร็จ รอเทส)</w:t>
+              <w:t xml:space="preserve">ขวดยา + มานา + ES, ธาตุ + สถานะผิดปกติ, รูนสลักหิน (โค้ดเสร็จ รอเทส)</w:t>
             </w:r>
           </w:p>
         </w:tc>
@@ -6158,7 +6158,7 @@
           <w:color w:val="1f1f1f"/>
           <w:rtl w:val="0"/>
         </w:rPr>
-        <w:t xml:space="preserve"> ไฟทำให้ติดไฟ น้ำแข็งทำให้ช้าหรือแข็ง สายฟ้าทำให้รับดาเมจเพิ่ม และมี affix ค่าต้านทาน เป็นฐานของรูน หินคราฟต์ และแผ่นศิลา</w:t>
+        <w:t xml:space="preserve"> ไฟทำให้ติดไฟ น้ำแข็งทำให้ช้าหรือแข็ง สายฟ้าทำให้รับดาเมจเพิ่ม และมี affix ค่าต้านทาน เป็นฐานของรูน หินคราฟต์ และแผ่นศิลา (กำลังทำในเฟส 7)</w:t>
       </w:r>
     </w:p>
     <w:p>
@@ -6192,7 +6192,7 @@
           <w:color w:val="1f1f1f"/>
           <w:rtl w:val="0"/>
         </w:rPr>
-        <w:t xml:space="preserve"> ใส่ในสกิลได้สกิลละ 2-3 อัน เช่น วงกว้างขึ้น แตกเป็น 3 ทิศ เปลี่ยนเป็นธาตุไฟ ฆ่าแล้วศพระเบิด ต้องมีระบบธาตุก่อน</w:t>
+        <w:t xml:space="preserve"> ใส่ในสกิลได้สกิลละ 2-3 อัน เช่น วงกว้างขึ้น แตกเป็น 3 ทิศ เปลี่ยนเป็นธาตุไฟ ฆ่าแล้วศพระเบิด ต้องมีระบบธาตุก่อน (กำลังทำในเฟส 7)</w:t>
       </w:r>
     </w:p>
     <w:p>

</xml_diff>

<commit_message>
Add crafting stones, Stone Tablet runs and affix room indicators
Co-Authored-By: Claude Opus 5.5 <noreply@anthropic.com>
</commit_message>
<xml_diff>
--- a/Project poe.docx
+++ b/Project poe.docx
@@ -190,7 +190,7 @@
           <w:color w:val="1f1f1f"/>
           <w:rtl w:val="0"/>
         </w:rPr>
-        <w:t xml:space="preserve"> ขวดยาเลือด/มานา, แถบมานา, Energy Shield, ธาตุ + สถานะผิดปกติ + ค่าต้านทาน, คีย์ลัดกระเป๋า (Shift+คลิก สวมใส่, X ทิ้ง), รูนสลักหิน (โค้ดเสร็จ รอเทสใน Studio)</w:t>
+        <w:t xml:space="preserve"> ขวดยาเลือด/มานา, แถบมานา, Energy Shield, ธาตุ + สถานะผิดปกติ + ค่าต้านทาน, คีย์ลัดกระเป๋า (Shift+คลิก สวมใส่, X ทิ้ง), รูนสลักหิน, หินคราฟต์, แผ่นศิลา (โค้ดเสร็จ รอเทสใน Studio)</w:t>
       </w:r>
     </w:p>
     <w:p>
@@ -224,7 +224,7 @@
           <w:color w:val="1f1f1f"/>
           <w:rtl w:val="0"/>
         </w:rPr>
-        <w:t xml:space="preserve"> เทสขวดยา มานา ES ธาตุ และรูนใน Studio แล้วหยิบไอเดียถัดไปจากหัวข้อ 7. ไว้ทีหลัง (หินคราฟต์) ให้ทดสอบเล่นได้ทุก 1-2 สัปดาห์</w:t>
+        <w:t xml:space="preserve"> เทสระบบเฟส 7 ทั้งหมดใน Studio (ขวดยา มานา ES ธาตุ รูน หินคราฟต์ แผ่นศิลา) แล้วค่อยหยิบไอเดียถัดไปจากหัวข้อ 7. ไว้ทีหลัง (ผังพาสซีฟ + คลาส) ให้ทดสอบเล่นได้ทุก 1-2 สัปดาห์</w:t>
       </w:r>
     </w:p>
     <w:p>
@@ -2582,7 +2582,7 @@
                 <w:color w:val="1f1f1f"/>
                 <w:rtl w:val="0"/>
               </w:rPr>
-              <w:t xml:space="preserve">ขวดยา + มานา + ES, ธาตุ + สถานะผิดปกติ, รูนสลักหิน (โค้ดเสร็จ รอเทส)</w:t>
+              <w:t xml:space="preserve">ขวดยา + มานา + ES, ธาตุ + สถานะผิดปกติ, รูนสลักหิน, หินคราฟต์, แผ่นศิลา (โค้ดเสร็จ รอเทส)</w:t>
             </w:r>
           </w:p>
         </w:tc>
@@ -6226,7 +6226,7 @@
           <w:color w:val="1f1f1f"/>
           <w:rtl w:val="0"/>
         </w:rPr>
-        <w:t xml:space="preserve"> ของดรอปที่ใช้กับไอเทม เช่น เพิ่ม affix, สุ่ม affix ใหม่, อัปความหายาก ต่อยอดจาก ItemData + Loot ที่มีอยู่</w:t>
+        <w:t xml:space="preserve"> ของดรอปที่ใช้กับไอเทม เช่น เพิ่ม affix, สุ่ม affix ใหม่, อัปความหายาก ต่อยอดจาก ItemData + Loot ที่มีอยู่ (กำลังทำในเฟส 7)</w:t>
       </w:r>
     </w:p>
     <w:p>
@@ -6260,7 +6260,7 @@
           <w:color w:val="1f1f1f"/>
           <w:rtl w:val="0"/>
         </w:rPr>
-        <w:t xml:space="preserve"> ใส่ก่อนเข้าประตูด่าน มีม็อดสุ่ม เช่น ศัตรูเร็วขึ้น 20% แต่ดรอปเพิ่ม 30% ระดับยิ่งสูงยิ่งยากแต่ของยิ่งดี</w:t>
+        <w:t xml:space="preserve"> ใส่ก่อนเข้าประตูด่าน มีม็อดสุ่ม เช่น ศัตรูเร็วขึ้น 20% แต่ดรอปเพิ่ม 30% ระดับยิ่งสูงยิ่งยากแต่ของยิ่งดี (กำลังทำในเฟส 7)</w:t>
       </w:r>
     </w:p>
     <w:p>

</xml_diff>

<commit_message>
Add passive tree with Warrior, Ranger and Mystic classes
Co-Authored-By: Claude Opus 5.5 <noreply@anthropic.com>
</commit_message>
<xml_diff>
--- a/Project poe.docx
+++ b/Project poe.docx
@@ -190,7 +190,7 @@
           <w:color w:val="1f1f1f"/>
           <w:rtl w:val="0"/>
         </w:rPr>
-        <w:t xml:space="preserve"> ขวดยาเลือด/มานา, แถบมานา, Energy Shield, ธาตุ + สถานะผิดปกติ + ค่าต้านทาน, คีย์ลัดกระเป๋า (Shift+คลิก สวมใส่, X ทิ้ง), รูนสลักหิน, หินคราฟต์, แผ่นศิลา (โค้ดเสร็จ รอเทสใน Studio)</w:t>
+        <w:t xml:space="preserve"> ขวดยาเลือด/มานา, แถบมานา, Energy Shield, ธาตุ + สถานะผิดปกติ + ค่าต้านทาน, คีย์ลัดกระเป๋า (Shift+คลิก สวมใส่, X ทิ้ง), รูนสลักหิน, หินคราฟต์, แผ่นศิลา, ผังพาสซีฟ + คลาส (เทสใน Studio ผ่าน)</w:t>
       </w:r>
     </w:p>
     <w:p>
@@ -224,7 +224,7 @@
           <w:color w:val="1f1f1f"/>
           <w:rtl w:val="0"/>
         </w:rPr>
-        <w:t xml:space="preserve"> เทสระบบเฟส 7 ทั้งหมดใน Studio (ขวดยา มานา ES ธาตุ รูน หินคราฟต์ แผ่นศิลา) แล้วค่อยหยิบไอเดียถัดไปจากหัวข้อ 7. ไว้ทีหลัง (ผังพาสซีฟ + คลาส) ให้ทดสอบเล่นได้ทุก 1-2 สัปดาห์</w:t>
+        <w:t xml:space="preserve"> ให้คนลองเล่นระบบเฟส 7 (ขวดยา มานา ES ธาตุ รูน หินคราฟต์ แผ่นศิลา ผังพาสซีฟ) ดูบาลานซ์กับจุดที่ไม่เข้าใจ แล้วจดไอเดียใหม่ลงหัวข้อ 7 ให้ทดสอบเล่นได้ทุก 1-2 สัปดาห์</w:t>
       </w:r>
     </w:p>
     <w:p>
@@ -2582,7 +2582,7 @@
                 <w:color w:val="1f1f1f"/>
                 <w:rtl w:val="0"/>
               </w:rPr>
-              <w:t xml:space="preserve">ขวดยา + มานา + ES, ธาตุ + สถานะผิดปกติ, รูนสลักหิน, หินคราฟต์, แผ่นศิลา (โค้ดเสร็จ รอเทส)</w:t>
+              <w:t xml:space="preserve">ขวดยา + มานา + ES, ธาตุ + สถานะผิดปกติ, รูนสลักหิน, หินคราฟต์, แผ่นศิลา, ผังพาสซีฟ + คลาส (เทสผ่าน รอให้คนลองเล่น)</w:t>
             </w:r>
           </w:p>
         </w:tc>
@@ -6124,7 +6124,7 @@
           <w:color w:val="1f1f1f"/>
           <w:rtl w:val="0"/>
         </w:rPr>
-        <w:t xml:space="preserve"> เติมเองตอนฆ่าศัตรู กดใช้ได้ทั้ง PC และมือถือ ใช้คู่กับกลิ้งหลบที่ทำแล้วในเฟส 6 (กำลังทำในเฟส 7 พร้อมขวดมานา)</w:t>
+        <w:t xml:space="preserve"> เติมเองตอนฆ่าศัตรู กดใช้ได้ทั้ง PC และมือถือ ใช้คู่กับกลิ้งหลบที่ทำแล้วในเฟส 6 (ทำแล้วในเฟส 7 พร้อมขวดมานา)</w:t>
       </w:r>
     </w:p>
     <w:p>
@@ -6158,7 +6158,7 @@
           <w:color w:val="1f1f1f"/>
           <w:rtl w:val="0"/>
         </w:rPr>
-        <w:t xml:space="preserve"> ไฟทำให้ติดไฟ น้ำแข็งทำให้ช้าหรือแข็ง สายฟ้าทำให้รับดาเมจเพิ่ม และมี affix ค่าต้านทาน เป็นฐานของรูน หินคราฟต์ และแผ่นศิลา (กำลังทำในเฟส 7)</w:t>
+        <w:t xml:space="preserve"> ไฟทำให้ติดไฟ น้ำแข็งทำให้ช้าหรือแข็ง สายฟ้าทำให้รับดาเมจเพิ่ม และมี affix ค่าต้านทาน เป็นฐานของรูน หินคราฟต์ และแผ่นศิลา (ทำแล้วในเฟส 7)</w:t>
       </w:r>
     </w:p>
     <w:p>
@@ -6192,7 +6192,7 @@
           <w:color w:val="1f1f1f"/>
           <w:rtl w:val="0"/>
         </w:rPr>
-        <w:t xml:space="preserve"> ใส่ในสกิลได้สกิลละ 2-3 อัน เช่น วงกว้างขึ้น แตกเป็น 3 ทิศ เปลี่ยนเป็นธาตุไฟ ฆ่าแล้วศพระเบิด ต้องมีระบบธาตุก่อน (กำลังทำในเฟส 7)</w:t>
+        <w:t xml:space="preserve"> ใส่ในสกิลได้สกิลละ 2-3 อัน เช่น วงกว้างขึ้น แตกเป็น 3 ทิศ เปลี่ยนเป็นธาตุไฟ ฆ่าแล้วศพระเบิด ต้องมีระบบธาตุก่อน (ทำแล้วในเฟส 7)</w:t>
       </w:r>
     </w:p>
     <w:p>
@@ -6226,7 +6226,7 @@
           <w:color w:val="1f1f1f"/>
           <w:rtl w:val="0"/>
         </w:rPr>
-        <w:t xml:space="preserve"> ของดรอปที่ใช้กับไอเทม เช่น เพิ่ม affix, สุ่ม affix ใหม่, อัปความหายาก ต่อยอดจาก ItemData + Loot ที่มีอยู่ (กำลังทำในเฟส 7)</w:t>
+        <w:t xml:space="preserve"> ของดรอปที่ใช้กับไอเทม เช่น เพิ่ม affix, สุ่ม affix ใหม่, อัปความหายาก ต่อยอดจาก ItemData + Loot ที่มีอยู่ (ทำแล้วในเฟส 7)</w:t>
       </w:r>
     </w:p>
     <w:p>
@@ -6260,7 +6260,7 @@
           <w:color w:val="1f1f1f"/>
           <w:rtl w:val="0"/>
         </w:rPr>
-        <w:t xml:space="preserve"> ใส่ก่อนเข้าประตูด่าน มีม็อดสุ่ม เช่น ศัตรูเร็วขึ้น 20% แต่ดรอปเพิ่ม 30% ระดับยิ่งสูงยิ่งยากแต่ของยิ่งดี (กำลังทำในเฟส 7)</w:t>
+        <w:t xml:space="preserve"> ใส่ก่อนเข้าประตูด่าน มีม็อดสุ่ม เช่น ศัตรูเร็วขึ้น 20% แต่ดรอปเพิ่ม 30% ระดับยิ่งสูงยิ่งยากแต่ของยิ่งดี (ทำแล้วในเฟส 7)</w:t>
       </w:r>
     </w:p>
     <w:p>
@@ -6294,7 +6294,7 @@
           <w:color w:val="1f1f1f"/>
           <w:rtl w:val="0"/>
         </w:rPr>
-        <w:t xml:space="preserve"> เก็บไว้ท้ายสุด เพราะเป็นงานใหญ่ อยู่นอก MVP และทำบนจอมือถือยาก</w:t>
+        <w:t xml:space="preserve"> เก็บไว้ท้ายสุด เพราะเป็นงานใหญ่ อยู่นอก MVP และทำบนจอมือถือยาก (ทำแล้วในเฟส 7: ผังเล็ก 35 จุด + 3 คลาสที่เริ่มคนละจุด)</w:t>
       </w:r>
     </w:p>
     <w:p>

</xml_diff>

<commit_message>
docs: switch game concept to PoE2 + Torchlight Infinite
Sync Project poe.docx with the team Google Doc:
- Title and section 2: concept now mixes PoE2 depth (builds, crafting,
  readable bosses, dodge) with Torchlight Infinite speed and variety
  (hero mechanics, fast dense maps, auto-pickup, pets, map board).
- Phase table: phase 8 (not started).
- Section 7: 8 phase-8 ideas in priority order, starting with more
  skills + skill stones; naming rule now also covers Torchlight names.
- Status: Lobby hub script has been run in Studio.

Co-Authored-By: Claude Opus 5.5 <noreply@anthropic.com>
</commit_message>
<xml_diff>
--- a/Project poe.docx
+++ b/Project poe.docx
@@ -20,7 +20,7 @@
           <w:szCs w:val="46"/>
           <w:rtl w:val="0"/>
         </w:rPr>
-        <w:t xml:space="preserve">แผนการพัฒนาเกม Roblox ARPG (สไตล์ Path of Exile)</w:t>
+        <w:t xml:space="preserve">แผนการพัฒนาเกม Roblox ARPG (สไตล์ Path of Exile 2 + Torchlight Infinite)</w:t>
       </w:r>
       <w:r>
         <w:rPr>
@@ -190,7 +190,7 @@
           <w:color w:val="1f1f1f"/>
           <w:rtl w:val="0"/>
         </w:rPr>
-        <w:t xml:space="preserve"> ขวดยาเลือด/มานา, แถบมานา, Energy Shield, ธาตุ + สถานะผิดปกติ + ค่าต้านทาน, คีย์ลัดกระเป๋า (Shift+คลิก สวมใส่, X ทิ้ง), รูนสลักหิน, หินคราฟต์, แผ่นศิลา, ผังพาสซีฟ + คลาส (เทสใน Studio ผ่าน)</w:t>
+        <w:t xml:space="preserve"> ขวดยาเลือด/มานา, แถบมานา, Energy Shield, ธาตุ + สถานะผิดปกติ + ค่าต้านทาน, คีย์ลัดกระเป๋า (Shift+คลิก สวมใส่, X ทิ้ง), รูนสลักหิน, หินคราฟต์, แผ่นศิลา, ผังพาสซีฟ + คลาส (เทสใน Studio ผ่าน) / งานแมพ: เมือง Lobby แบบ blockout (รันสคริปต์ tools/BuildLobbyHub ใน Studio แล้ว)</w:t>
       </w:r>
     </w:p>
     <w:p>
@@ -224,7 +224,7 @@
           <w:color w:val="1f1f1f"/>
           <w:rtl w:val="0"/>
         </w:rPr>
-        <w:t xml:space="preserve"> ให้คนลองเล่นระบบเฟส 7 (ขวดยา มานา ES ธาตุ รูน หินคราฟต์ แผ่นศิลา ผังพาสซีฟ) ดูบาลานซ์กับจุดที่ไม่เข้าใจ แล้วจดไอเดียใหม่ลงหัวข้อ 7 ให้ทดสอบเล่นได้ทุก 1-2 สัปดาห์</w:t>
+        <w:t xml:space="preserve"> ให้คนลองเล่นระบบเฟส 7 (ขวดยา มานา ES ธาตุ รูน หินคราฟต์ แผ่นศิลา ผังพาสซีฟ) ดูบาลานซ์กับจุดที่ไม่เข้าใจ แล้วเริ่มเฟส 8 ตามแนวคิดใหม่ PoE2 + Torchlight Infinite (หัวข้อ 2 และ 7) เริ่มจากสกิลเพิ่ม + ศิลาสกิล ให้ทดสอบเล่นได้ทุก 1-2 สัปดาห์</w:t>
       </w:r>
     </w:p>
     <w:p>
@@ -2590,6 +2590,255 @@
       <w:tr>
         <w:trPr>
           <w:cantSplit w:val="0"/>
+          <w:trHeight w:val="825" w:hRule="atLeast"/>
+          <w:tblHeader w:val="0"/>
+        </w:trPr>
+        <w:tc>
+          <w:tcPr>
+            <w:tcBorders>
+              <w:top w:color="c4c7c5" w:space="0" w:sz="7" w:val="single"/>
+              <w:left w:color="c4c7c5" w:space="0" w:sz="7" w:val="single"/>
+              <w:bottom w:color="c4c7c5" w:space="0" w:sz="7" w:val="single"/>
+              <w:right w:color="c4c7c5" w:space="0" w:sz="7" w:val="single"/>
+            </w:tcBorders>
+            <w:shd w:fill="f8fafd" w:val="clear"/>
+            <w:tcMar>
+              <w:top w:w="120.0" w:type="dxa"/>
+              <w:left w:w="180.0" w:type="dxa"/>
+              <w:bottom w:w="120.0" w:type="dxa"/>
+              <w:right w:w="180.0" w:type="dxa"/>
+            </w:tcMar>
+            <w:vAlign w:val="top"/>
+          </w:tcPr>
+          <w:p>
+            <w:pPr>
+              <w:pBdr>
+                <w:top w:color="auto" w:space="0" w:sz="0" w:val="none"/>
+                <w:left w:color="auto" w:space="0" w:sz="0" w:val="none"/>
+                <w:bottom w:color="auto" w:space="0" w:sz="0" w:val="none"/>
+                <w:right w:color="auto" w:space="0" w:sz="0" w:val="none"/>
+                <w:between w:color="auto" w:space="0" w:sz="0" w:val="none"/>
+              </w:pBdr>
+              <w:spacing w:after="480" w:lineRule="auto"/>
+              <w:rPr>
+                <w:color w:val="1f1f1f"/>
+              </w:rPr>
+            </w:pPr>
+            <w:r>
+              <w:rPr>
+                <w:color w:val="1f1f1f"/>
+                <w:rtl w:val="0"/>
+              </w:rPr>
+              <w:t xml:space="preserve">8</w:t>
+            </w:r>
+          </w:p>
+        </w:tc>
+        <w:tc>
+          <w:tcPr>
+            <w:tcBorders>
+              <w:top w:color="c4c7c5" w:space="0" w:sz="7" w:val="single"/>
+              <w:left w:color="c4c7c5" w:space="0" w:sz="7" w:val="single"/>
+              <w:bottom w:color="c4c7c5" w:space="0" w:sz="7" w:val="single"/>
+              <w:right w:color="c4c7c5" w:space="0" w:sz="7" w:val="single"/>
+            </w:tcBorders>
+            <w:shd w:fill="f8fafd" w:val="clear"/>
+            <w:tcMar>
+              <w:top w:w="120.0" w:type="dxa"/>
+              <w:left w:w="180.0" w:type="dxa"/>
+              <w:bottom w:w="120.0" w:type="dxa"/>
+              <w:right w:w="180.0" w:type="dxa"/>
+            </w:tcMar>
+            <w:vAlign w:val="top"/>
+          </w:tcPr>
+          <w:p>
+            <w:pPr>
+              <w:pBdr>
+                <w:top w:color="auto" w:space="0" w:sz="0" w:val="none"/>
+                <w:left w:color="auto" w:space="0" w:sz="0" w:val="none"/>
+                <w:bottom w:color="auto" w:space="0" w:sz="0" w:val="none"/>
+                <w:right w:color="auto" w:space="0" w:sz="0" w:val="none"/>
+                <w:between w:color="auto" w:space="0" w:sz="0" w:val="none"/>
+              </w:pBdr>
+              <w:spacing w:after="480" w:lineRule="auto"/>
+              <w:rPr>
+                <w:color w:val="1f1f1f"/>
+              </w:rPr>
+            </w:pPr>
+            <w:r>
+              <w:rPr>
+                <w:rFonts w:ascii="Arial Unicode MS" w:cs="Arial Unicode MS" w:eastAsia="Arial Unicode MS" w:hAnsi="Arial Unicode MS"/>
+                <w:color w:val="1f1f1f"/>
+                <w:rtl w:val="0"/>
+              </w:rPr>
+              <w:t xml:space="preserve">แนวคิดใหม่ PoE2 + Torchlight Infinite</w:t>
+            </w:r>
+          </w:p>
+        </w:tc>
+        <w:tc>
+          <w:tcPr>
+            <w:tcBorders>
+              <w:top w:color="c4c7c5" w:space="0" w:sz="7" w:val="single"/>
+              <w:left w:color="c4c7c5" w:space="0" w:sz="7" w:val="single"/>
+              <w:bottom w:color="c4c7c5" w:space="0" w:sz="7" w:val="single"/>
+              <w:right w:color="c4c7c5" w:space="0" w:sz="7" w:val="single"/>
+            </w:tcBorders>
+            <w:shd w:fill="f8fafd" w:val="clear"/>
+            <w:tcMar>
+              <w:top w:w="120.0" w:type="dxa"/>
+              <w:left w:w="180.0" w:type="dxa"/>
+              <w:bottom w:w="120.0" w:type="dxa"/>
+              <w:right w:w="180.0" w:type="dxa"/>
+            </w:tcMar>
+            <w:vAlign w:val="top"/>
+          </w:tcPr>
+          <w:p>
+            <w:pPr>
+              <w:pBdr>
+                <w:top w:color="auto" w:space="0" w:sz="0" w:val="none"/>
+                <w:left w:color="auto" w:space="0" w:sz="0" w:val="none"/>
+                <w:bottom w:color="auto" w:space="0" w:sz="0" w:val="none"/>
+                <w:right w:color="auto" w:space="0" w:sz="0" w:val="none"/>
+                <w:between w:color="auto" w:space="0" w:sz="0" w:val="none"/>
+              </w:pBdr>
+              <w:spacing w:after="480" w:lineRule="auto"/>
+              <w:rPr>
+                <w:color w:val="1f1f1f"/>
+              </w:rPr>
+            </w:pPr>
+            <w:r>
+              <w:rPr>
+                <w:rFonts w:ascii="Arial Unicode MS" w:cs="Arial Unicode MS" w:eastAsia="Arial Unicode MS" w:hAnsi="Arial Unicode MS"/>
+                <w:color w:val="1f1f1f"/>
+                <w:rtl w:val="0"/>
+              </w:rPr>
+              <w:t xml:space="preserve">ยังไม่เริ่ม</w:t>
+            </w:r>
+          </w:p>
+        </w:tc>
+        <w:tc>
+          <w:tcPr>
+            <w:tcBorders>
+              <w:top w:color="c4c7c5" w:space="0" w:sz="7" w:val="single"/>
+              <w:left w:color="c4c7c5" w:space="0" w:sz="7" w:val="single"/>
+              <w:bottom w:color="c4c7c5" w:space="0" w:sz="7" w:val="single"/>
+              <w:right w:color="c4c7c5" w:space="0" w:sz="7" w:val="single"/>
+            </w:tcBorders>
+            <w:shd w:fill="f8fafd" w:val="clear"/>
+            <w:tcMar>
+              <w:top w:w="120.0" w:type="dxa"/>
+              <w:left w:w="180.0" w:type="dxa"/>
+              <w:bottom w:w="120.0" w:type="dxa"/>
+              <w:right w:w="180.0" w:type="dxa"/>
+            </w:tcMar>
+            <w:vAlign w:val="top"/>
+          </w:tcPr>
+          <w:p>
+            <w:pPr>
+              <w:pBdr>
+                <w:top w:color="auto" w:space="0" w:sz="0" w:val="none"/>
+                <w:left w:color="auto" w:space="0" w:sz="0" w:val="none"/>
+                <w:bottom w:color="auto" w:space="0" w:sz="0" w:val="none"/>
+                <w:right w:color="auto" w:space="0" w:sz="0" w:val="none"/>
+                <w:between w:color="auto" w:space="0" w:sz="0" w:val="none"/>
+              </w:pBdr>
+              <w:spacing w:after="480" w:lineRule="auto"/>
+              <w:rPr>
+                <w:color w:val="1f1f1f"/>
+              </w:rPr>
+            </w:pPr>
+            <w:r>
+              <w:rPr>
+                <w:color w:val="1f1f1f"/>
+                <w:rtl w:val="0"/>
+              </w:rPr>
+              <w:t xml:space="preserve">-</w:t>
+            </w:r>
+          </w:p>
+        </w:tc>
+        <w:tc>
+          <w:tcPr>
+            <w:tcBorders>
+              <w:top w:color="c4c7c5" w:space="0" w:sz="7" w:val="single"/>
+              <w:left w:color="c4c7c5" w:space="0" w:sz="7" w:val="single"/>
+              <w:bottom w:color="c4c7c5" w:space="0" w:sz="7" w:val="single"/>
+              <w:right w:color="c4c7c5" w:space="0" w:sz="7" w:val="single"/>
+            </w:tcBorders>
+            <w:shd w:fill="f8fafd" w:val="clear"/>
+            <w:tcMar>
+              <w:top w:w="120.0" w:type="dxa"/>
+              <w:left w:w="180.0" w:type="dxa"/>
+              <w:bottom w:w="120.0" w:type="dxa"/>
+              <w:right w:w="180.0" w:type="dxa"/>
+            </w:tcMar>
+            <w:vAlign w:val="top"/>
+          </w:tcPr>
+          <w:p>
+            <w:pPr>
+              <w:pBdr>
+                <w:top w:color="auto" w:space="0" w:sz="0" w:val="none"/>
+                <w:left w:color="auto" w:space="0" w:sz="0" w:val="none"/>
+                <w:bottom w:color="auto" w:space="0" w:sz="0" w:val="none"/>
+                <w:right w:color="auto" w:space="0" w:sz="0" w:val="none"/>
+                <w:between w:color="auto" w:space="0" w:sz="0" w:val="none"/>
+              </w:pBdr>
+              <w:spacing w:after="480" w:lineRule="auto"/>
+              <w:rPr>
+                <w:color w:val="1f1f1f"/>
+              </w:rPr>
+            </w:pPr>
+            <w:r>
+              <w:rPr>
+                <w:color w:val="1f1f1f"/>
+                <w:rtl w:val="0"/>
+              </w:rPr>
+              <w:t xml:space="preserve">-</w:t>
+            </w:r>
+          </w:p>
+        </w:tc>
+        <w:tc>
+          <w:tcPr>
+            <w:tcBorders>
+              <w:top w:color="c4c7c5" w:space="0" w:sz="7" w:val="single"/>
+              <w:left w:color="c4c7c5" w:space="0" w:sz="7" w:val="single"/>
+              <w:bottom w:color="c4c7c5" w:space="0" w:sz="7" w:val="single"/>
+              <w:right w:color="c4c7c5" w:space="0" w:sz="7" w:val="single"/>
+            </w:tcBorders>
+            <w:shd w:fill="f8fafd" w:val="clear"/>
+            <w:tcMar>
+              <w:top w:w="120.0" w:type="dxa"/>
+              <w:left w:w="180.0" w:type="dxa"/>
+              <w:bottom w:w="120.0" w:type="dxa"/>
+              <w:right w:w="180.0" w:type="dxa"/>
+            </w:tcMar>
+            <w:vAlign w:val="top"/>
+          </w:tcPr>
+          <w:p>
+            <w:pPr>
+              <w:pBdr>
+                <w:top w:color="auto" w:space="0" w:sz="0" w:val="none"/>
+                <w:left w:color="auto" w:space="0" w:sz="0" w:val="none"/>
+                <w:bottom w:color="auto" w:space="0" w:sz="0" w:val="none"/>
+                <w:right w:color="auto" w:space="0" w:sz="0" w:val="none"/>
+                <w:between w:color="auto" w:space="0" w:sz="0" w:val="none"/>
+              </w:pBdr>
+              <w:spacing w:after="480" w:lineRule="auto"/>
+              <w:rPr>
+                <w:color w:val="1f1f1f"/>
+              </w:rPr>
+            </w:pPr>
+            <w:r>
+              <w:rPr>
+                <w:color w:val="1f1f1f"/>
+                <w:rtl w:val="0"/>
+              </w:rPr>
+              <w:t xml:space="preserve">ไอเดียเรียงไว้ในหัวข้อ 7 เริ่มจากสกิลเพิ่ม + ศิลาสกิล</w:t>
+            </w:r>
+          </w:p>
+        </w:tc>
+      </w:tr>
+      <w:tr>
+        <w:trPr>
+          <w:cantSplit w:val="0"/>
           <w:trHeight w:val="1095" w:hRule="atLeast"/>
           <w:tblHeader w:val="0"/>
         </w:trPr>
@@ -2856,7 +3105,7 @@
           <w:color w:val="1f1f1f"/>
           <w:rtl w:val="0"/>
         </w:rPr>
-        <w:t xml:space="preserve"> เกม Action RPG มุมมองบุคคลที่สาม/เฉียง ที่เน้นการฟาร์มมอนสเตอร์ สุ่มไอเทมพร้อมออปชันพิเศษ (Affixes) และเปิดให้ออกแบบบิลด์สกิลคอมโบได้อย่างอิสระเพื่อไต่ระดับความยาก</w:t>
+        <w:t xml:space="preserve"> เกม Action RPG มุมมองบุคคลที่สาม/เฉียง ที่ผสมความลึกของ Path of Exile 2 (บิลด์ คราฟต์ บอสที่ต้องอ่านท่าและกลิ้งหลบ) เข้ากับความเร็วและความหลากหลายของ Torchlight Infinite (ฮีโร่แต่ละตัวเล่นต่างกัน ลุยด่านเร็ว มอนเยอะ ของดรอปเยอะ) ให้ผู้เล่นแต่ละคนหาสไตล์ที่ชอบได้ และเล่นรอบสั้นๆ บนมือถือก็สนุก</w:t>
       </w:r>
       <w:r>
         <w:rPr>
@@ -2889,7 +3138,7 @@
           <w:color w:val="1f1f1f"/>
           <w:rtl w:val="0"/>
         </w:rPr>
-        <w:t xml:space="preserve"> ปราบมอนสเตอร์ → สะสมและสุ่มสเตตัสไอเทม → พัฒนาตัวละคร (อัปเกรด/จัดเซ็ตสกิล) → ท้าทายด่านหรือบอสระดับสูงขึ้น</w:t>
+        <w:t xml:space="preserve"> เลือกฮีโร่ → ลุยด่านเร็วๆ ฆ่ามอนเป็นฝูง → เก็บไอเทม หินคราฟต์ และแผ่นศิลา → คราฟต์ไอเทม แต่งสกิลด้วยรูน ลงผังพาสซีฟ → ท้าบอสที่ต้องอ่านท่า → ใส่แผ่นศิลาระดับสูงขึ้น</w:t>
       </w:r>
       <w:r>
         <w:rPr>
@@ -2914,7 +3163,40 @@
           <w:color w:val="1f1f1f"/>
           <w:rtl w:val="0"/>
         </w:rPr>
-        <w:t xml:space="preserve">เอกลักษณ์จาก Path of Exile ที่นำมาใช้:</w:t>
+        <w:t xml:space="preserve">หลักผสม 2 เกม:</w:t>
+      </w:r>
+      <w:r>
+        <w:rPr>
+          <w:rFonts w:ascii="Arial Unicode MS" w:cs="Arial Unicode MS" w:eastAsia="Arial Unicode MS" w:hAnsi="Arial Unicode MS"/>
+          <w:color w:val="1f1f1f"/>
+          <w:rtl w:val="0"/>
+        </w:rPr>
+        <w:t xml:space="preserve"> ด่านธรรมดาเล่นเร็วแบบ Torchlight Infinite (ฆ่าเป็นฝูง เก็บของไว) ส่วนบอสเล่นช้าแบบ PoE2 (ง้างท่าให้เห็น ต้องกลิ้งหลบแล้วสวน) และทุกระบบใหม่ต้องเล่นบนมือถือได้</w:t>
+      </w:r>
+      <w:r>
+        <w:rPr>
+          <w:rtl w:val="0"/>
+        </w:rPr>
+      </w:r>
+    </w:p>
+    <w:p>
+      <w:pPr>
+        <w:numPr>
+          <w:ilvl w:val="0"/>
+          <w:numId w:val="6"/>
+        </w:numPr>
+        <w:spacing w:after="0" w:afterAutospacing="0" w:lineRule="auto"/>
+        <w:ind w:left="720" w:hanging="360"/>
+      </w:pPr>
+      <w:r>
+        <w:rPr>
+          <w:rFonts w:ascii="Arial Unicode MS" w:cs="Arial Unicode MS" w:eastAsia="Arial Unicode MS" w:hAnsi="Arial Unicode MS"/>
+          <w:b w:val="1"/>
+          <w:bCs w:val="1"/>
+          <w:color w:val="1f1f1f"/>
+          <w:rtl w:val="0"/>
+        </w:rPr>
+        <w:t xml:space="preserve">สิ่งที่หยิบมาจาก Path of Exile 2 (ความลึก):</w:t>
       </w:r>
       <w:r>
         <w:rPr>
@@ -2984,6 +3266,169 @@
           <w:rtl w:val="0"/>
         </w:rPr>
         <w:t xml:space="preserve">ระบบอุปกรณ์ที่มีการสุ่มคุณสมบัติ (Randomized Affixes: Prefix / Suffix)</w:t>
+      </w:r>
+      <w:r>
+        <w:rPr>
+          <w:rtl w:val="0"/>
+        </w:rPr>
+      </w:r>
+    </w:p>
+    <w:p>
+      <w:pPr>
+        <w:numPr>
+          <w:ilvl w:val="1"/>
+          <w:numId w:val="6"/>
+        </w:numPr>
+        <w:spacing w:after="0" w:afterAutospacing="0" w:lineRule="auto"/>
+        <w:ind w:left="1440" w:hanging="360"/>
+      </w:pPr>
+      <w:r>
+        <w:rPr>
+          <w:rFonts w:ascii="Arial Unicode MS" w:cs="Arial Unicode MS" w:eastAsia="Arial Unicode MS" w:hAnsi="Arial Unicode MS"/>
+          <w:color w:val="1f1f1f"/>
+          <w:rtl w:val="0"/>
+        </w:rPr>
+        <w:t xml:space="preserve">การต่อสู้มีจังหวะ กลิ้งหลบได้ และบอสง้างท่าให้เห็นก่อนตี ต้องอ่านท่าก่อนสวน</w:t>
+      </w:r>
+      <w:r>
+        <w:rPr>
+          <w:rtl w:val="0"/>
+        </w:rPr>
+      </w:r>
+    </w:p>
+    <w:p>
+      <w:pPr>
+        <w:numPr>
+          <w:ilvl w:val="0"/>
+          <w:numId w:val="6"/>
+        </w:numPr>
+        <w:spacing w:after="0" w:afterAutospacing="0" w:lineRule="auto"/>
+        <w:ind w:left="720" w:hanging="360"/>
+      </w:pPr>
+      <w:r>
+        <w:rPr>
+          <w:rFonts w:ascii="Arial Unicode MS" w:cs="Arial Unicode MS" w:eastAsia="Arial Unicode MS" w:hAnsi="Arial Unicode MS"/>
+          <w:b w:val="1"/>
+          <w:bCs w:val="1"/>
+          <w:color w:val="1f1f1f"/>
+          <w:rtl w:val="0"/>
+        </w:rPr>
+        <w:t xml:space="preserve">สิ่งที่หยิบมาจาก Torchlight Infinite (ความเร็ว + ความหลากหลาย):</w:t>
+      </w:r>
+      <w:r>
+        <w:rPr>
+          <w:rtl w:val="0"/>
+        </w:rPr>
+      </w:r>
+    </w:p>
+    <w:p>
+      <w:pPr>
+        <w:numPr>
+          <w:ilvl w:val="1"/>
+          <w:numId w:val="6"/>
+        </w:numPr>
+        <w:spacing w:after="0" w:afterAutospacing="0" w:lineRule="auto"/>
+        <w:ind w:left="1440" w:hanging="360"/>
+      </w:pPr>
+      <w:r>
+        <w:rPr>
+          <w:rFonts w:ascii="Arial Unicode MS" w:cs="Arial Unicode MS" w:eastAsia="Arial Unicode MS" w:hAnsi="Arial Unicode MS"/>
+          <w:color w:val="1f1f1f"/>
+          <w:rtl w:val="0"/>
+        </w:rPr>
+        <w:t xml:space="preserve">ฮีโร่แต่ละตัวมีกลไกเฉพาะตัวที่ทำให้วิธีเล่นต่างกัน</w:t>
+      </w:r>
+      <w:r>
+        <w:rPr>
+          <w:rtl w:val="0"/>
+        </w:rPr>
+      </w:r>
+    </w:p>
+    <w:p>
+      <w:pPr>
+        <w:numPr>
+          <w:ilvl w:val="1"/>
+          <w:numId w:val="6"/>
+        </w:numPr>
+        <w:spacing w:after="0" w:afterAutospacing="0" w:lineRule="auto"/>
+        <w:ind w:left="1440" w:hanging="360"/>
+      </w:pPr>
+      <w:r>
+        <w:rPr>
+          <w:rFonts w:ascii="Arial Unicode MS" w:cs="Arial Unicode MS" w:eastAsia="Arial Unicode MS" w:hAnsi="Arial Unicode MS"/>
+          <w:color w:val="1f1f1f"/>
+          <w:rtl w:val="0"/>
+        </w:rPr>
+        <w:t xml:space="preserve">สกิลให้เลือกเยอะ และมีสกิลที่ทำงานเองตามเงื่อนไข</w:t>
+      </w:r>
+      <w:r>
+        <w:rPr>
+          <w:rtl w:val="0"/>
+        </w:rPr>
+      </w:r>
+    </w:p>
+    <w:p>
+      <w:pPr>
+        <w:numPr>
+          <w:ilvl w:val="1"/>
+          <w:numId w:val="6"/>
+        </w:numPr>
+        <w:spacing w:after="0" w:afterAutospacing="0" w:lineRule="auto"/>
+        <w:ind w:left="1440" w:hanging="360"/>
+      </w:pPr>
+      <w:r>
+        <w:rPr>
+          <w:rFonts w:ascii="Arial Unicode MS" w:cs="Arial Unicode MS" w:eastAsia="Arial Unicode MS" w:hAnsi="Arial Unicode MS"/>
+          <w:color w:val="1f1f1f"/>
+          <w:rtl w:val="0"/>
+        </w:rPr>
+        <w:t xml:space="preserve">ด่านเร็ว มอนแน่น ของดรอปเยอะ หินและสกุลเงินเข้ากระเป๋าเอง</w:t>
+      </w:r>
+      <w:r>
+        <w:rPr>
+          <w:rtl w:val="0"/>
+        </w:rPr>
+      </w:r>
+    </w:p>
+    <w:p>
+      <w:pPr>
+        <w:numPr>
+          <w:ilvl w:val="1"/>
+          <w:numId w:val="6"/>
+        </w:numPr>
+        <w:spacing w:after="0" w:afterAutospacing="0" w:lineRule="auto"/>
+        <w:ind w:left="1440" w:hanging="360"/>
+      </w:pPr>
+      <w:r>
+        <w:rPr>
+          <w:rFonts w:ascii="Arial Unicode MS" w:cs="Arial Unicode MS" w:eastAsia="Arial Unicode MS" w:hAnsi="Arial Unicode MS"/>
+          <w:color w:val="1f1f1f"/>
+          <w:rtl w:val="0"/>
+        </w:rPr>
+        <w:t xml:space="preserve">สัตว์คู่หูที่ให้โบนัสติดตัว</w:t>
+      </w:r>
+      <w:r>
+        <w:rPr>
+          <w:rtl w:val="0"/>
+        </w:rPr>
+      </w:r>
+    </w:p>
+    <w:p>
+      <w:pPr>
+        <w:numPr>
+          <w:ilvl w:val="1"/>
+          <w:numId w:val="6"/>
+        </w:numPr>
+        <w:spacing w:after="0" w:afterAutospacing="0" w:lineRule="auto"/>
+        <w:ind w:left="1440" w:hanging="360"/>
+      </w:pPr>
+      <w:r>
+        <w:rPr>
+          <w:rFonts w:ascii="Arial Unicode MS" w:cs="Arial Unicode MS" w:eastAsia="Arial Unicode MS" w:hAnsi="Arial Unicode MS"/>
+          <w:color w:val="1f1f1f"/>
+          <w:rtl w:val="0"/>
+        </w:rPr>
+        <w:t xml:space="preserve">แผนที่ endgame ที่เลือกเส้นทางเอง</w:t>
       </w:r>
       <w:r>
         <w:rPr>
@@ -5619,7 +6064,7 @@
                 <w:color w:val="1f1f1f"/>
                 <w:rtl w:val="0"/>
               </w:rPr>
-              <w:t xml:space="preserve">หลีกเลี่ยงการดัดแปลงหรือใช้สินทรัพย์ที่มีลิขสิทธิ์จาก PoE โดยตรง ใช้ Free Assets หรือสร้างขึ้นเอง</w:t>
+              <w:t xml:space="preserve">หลีกเลี่ยงการดัดแปลงหรือใช้สินทรัพย์ที่มีลิขสิทธิ์จาก PoE หรือ Torchlight Infinite โดยตรง ใช้ Free Assets หรือสร้างขึ้นเอง</w:t>
             </w:r>
           </w:p>
         </w:tc>
@@ -6299,6 +6744,40 @@
     </w:p>
     <w:p>
       <w:pPr>
+        <w:pStyle w:val="Heading3"/>
+        <w:keepNext w:val="0"/>
+        <w:keepLines w:val="0"/>
+        <w:pBdr>
+          <w:top w:color="auto" w:space="0" w:sz="0" w:val="none"/>
+          <w:left w:color="auto" w:space="0" w:sz="0" w:val="none"/>
+          <w:bottom w:color="auto" w:space="0" w:sz="0" w:val="none"/>
+          <w:right w:color="auto" w:space="0" w:sz="0" w:val="none"/>
+          <w:between w:color="auto" w:space="0" w:sz="0" w:val="none"/>
+        </w:pBdr>
+        <w:spacing w:after="120" w:before="0" w:lineRule="auto"/>
+        <w:rPr>
+          <w:b w:val="1"/>
+          <w:bCs w:val="1"/>
+          <w:color w:val="1f1f1f"/>
+          <w:sz w:val="26"/>
+          <w:szCs w:val="26"/>
+        </w:rPr>
+      </w:pPr>
+      <w:r>
+        <w:rPr>
+          <w:rFonts w:ascii="Arial Unicode MS" w:cs="Arial Unicode MS" w:eastAsia="Arial Unicode MS" w:hAnsi="Arial Unicode MS"/>
+          <w:b w:val="1"/>
+          <w:bCs w:val="1"/>
+          <w:color w:val="1f1f1f"/>
+          <w:sz w:val="26"/>
+          <w:szCs w:val="26"/>
+          <w:rtl w:val="0"/>
+        </w:rPr>
+        <w:t xml:space="preserve">แนวคิดใหม่ PoE2 + Torchlight Infinite (เฟส 8 เรียงตามความคุ้ม)</w:t>
+      </w:r>
+    </w:p>
+    <w:p>
+      <w:pPr>
         <w:numPr>
           <w:ilvl w:val="0"/>
           <w:numId w:val="12"/>
@@ -6320,6 +6799,278 @@
           <w:color w:val="1f1f1f"/>
           <w:rtl w:val="0"/>
         </w:rPr>
+        <w:t xml:space="preserve">สกิลเพิ่ม + ศิลาสกิล:</w:t>
+      </w:r>
+      <w:r>
+        <w:rPr>
+          <w:rFonts w:ascii="Arial Unicode MS" w:cs="Arial Unicode MS" w:eastAsia="Arial Unicode MS" w:hAnsi="Arial Unicode MS"/>
+          <w:color w:val="1f1f1f"/>
+          <w:rtl w:val="0"/>
+        </w:rPr>
+        <w:t xml:space="preserve"> สกิลดรอปเป็นไอเทม (ศิลาสกิล) ใส่แถบสกิลได้ 4 ช่อง มีทั้งฟันใกล้ ยิงไกล และเวทไฟ/น้ำแข็ง/สายฟ้า ใส่รูนที่มีอยู่ได้ ทำก่อนเพราะตอนนี้มีแค่ 2 สกิล ความหลากหลายติดตรงนี้มากที่สุด</w:t>
+      </w:r>
+    </w:p>
+    <w:p>
+      <w:pPr>
+        <w:numPr>
+          <w:ilvl w:val="0"/>
+          <w:numId w:val="12"/>
+        </w:numPr>
+        <w:pBdr>
+          <w:top w:color="auto" w:space="0" w:sz="0" w:val="none"/>
+          <w:bottom w:color="auto" w:space="0" w:sz="0" w:val="none"/>
+          <w:right w:color="auto" w:space="0" w:sz="0" w:val="none"/>
+          <w:between w:color="auto" w:space="0" w:sz="0" w:val="none"/>
+        </w:pBdr>
+        <w:spacing w:after="0" w:afterAutospacing="0" w:lineRule="auto"/>
+        <w:ind w:left="720" w:hanging="360"/>
+      </w:pPr>
+      <w:r>
+        <w:rPr>
+          <w:rFonts w:ascii="Arial Unicode MS" w:cs="Arial Unicode MS" w:eastAsia="Arial Unicode MS" w:hAnsi="Arial Unicode MS"/>
+          <w:b w:val="1"/>
+          <w:bCs w:val="1"/>
+          <w:color w:val="1f1f1f"/>
+          <w:rtl w:val="0"/>
+        </w:rPr>
+        <w:t xml:space="preserve">ฮีโร่ + กลไกเฉพาะตัว:</w:t>
+      </w:r>
+      <w:r>
+        <w:rPr>
+          <w:rFonts w:ascii="Arial Unicode MS" w:cs="Arial Unicode MS" w:eastAsia="Arial Unicode MS" w:hAnsi="Arial Unicode MS"/>
+          <w:color w:val="1f1f1f"/>
+          <w:rtl w:val="0"/>
+        </w:rPr>
+        <w:t xml:space="preserve"> ต่อยอด 3 คลาสเดิมให้เล่นต่างกัน Warrior ตีโดนแล้วสะสมโทสะไว้ปล่อยท่าแรง, Ranger วิ่งหรือกลิ้งแล้วสะสมจังหวะ ยิ่งเยอะยิ่งตีเร็ว หยุดนิ่งแล้วหาย, Mystic ใช้มานาครบแล้วได้ลูกแก้วศิลาลอยรอบตัวยิงเอง เลเวล 10 เลือกสายกลไกได้ 1 ใน 2 แบบ ผังพาสซีฟยังใช้ร่วมกันเหมือนเดิม</w:t>
+      </w:r>
+    </w:p>
+    <w:p>
+      <w:pPr>
+        <w:numPr>
+          <w:ilvl w:val="0"/>
+          <w:numId w:val="12"/>
+        </w:numPr>
+        <w:pBdr>
+          <w:top w:color="auto" w:space="0" w:sz="0" w:val="none"/>
+          <w:bottom w:color="auto" w:space="0" w:sz="0" w:val="none"/>
+          <w:right w:color="auto" w:space="0" w:sz="0" w:val="none"/>
+          <w:between w:color="auto" w:space="0" w:sz="0" w:val="none"/>
+        </w:pBdr>
+        <w:spacing w:after="0" w:afterAutospacing="0" w:lineRule="auto"/>
+        <w:ind w:left="720" w:hanging="360"/>
+      </w:pPr>
+      <w:r>
+        <w:rPr>
+          <w:rFonts w:ascii="Arial Unicode MS" w:cs="Arial Unicode MS" w:eastAsia="Arial Unicode MS" w:hAnsi="Arial Unicode MS"/>
+          <w:b w:val="1"/>
+          <w:bCs w:val="1"/>
+          <w:color w:val="1f1f1f"/>
+          <w:rtl w:val="0"/>
+        </w:rPr>
+        <w:t xml:space="preserve">ด่านเร็ว มอนแน่น + เก็บของอัตโนมัติ:</w:t>
+      </w:r>
+      <w:r>
+        <w:rPr>
+          <w:rFonts w:ascii="Arial Unicode MS" w:cs="Arial Unicode MS" w:eastAsia="Arial Unicode MS" w:hAnsi="Arial Unicode MS"/>
+          <w:color w:val="1f1f1f"/>
+          <w:rtl w:val="0"/>
+        </w:rPr>
+        <w:t xml:space="preserve"> มอนเกิดเป็นฝูงใหญ่ (จำกัดจำนวนบนมือถือ) มีศัตรูใหม่ เช่น ตัวยิงไกล ตัวระเบิดตัวเอง หินคราฟต์ รูน และแผ่นศิลาเข้ากระเป๋าเองเมื่อเดินผ่าน ส่วนไอเทมสวมใส่ยังต้องกดเก็บ</w:t>
+      </w:r>
+    </w:p>
+    <w:p>
+      <w:pPr>
+        <w:numPr>
+          <w:ilvl w:val="0"/>
+          <w:numId w:val="12"/>
+        </w:numPr>
+        <w:pBdr>
+          <w:top w:color="auto" w:space="0" w:sz="0" w:val="none"/>
+          <w:bottom w:color="auto" w:space="0" w:sz="0" w:val="none"/>
+          <w:right w:color="auto" w:space="0" w:sz="0" w:val="none"/>
+          <w:between w:color="auto" w:space="0" w:sz="0" w:val="none"/>
+        </w:pBdr>
+        <w:spacing w:after="0" w:afterAutospacing="0" w:lineRule="auto"/>
+        <w:ind w:left="720" w:hanging="360"/>
+      </w:pPr>
+      <w:r>
+        <w:rPr>
+          <w:rFonts w:ascii="Arial Unicode MS" w:cs="Arial Unicode MS" w:eastAsia="Arial Unicode MS" w:hAnsi="Arial Unicode MS"/>
+          <w:b w:val="1"/>
+          <w:bCs w:val="1"/>
+          <w:color w:val="1f1f1f"/>
+          <w:rtl w:val="0"/>
+        </w:rPr>
+        <w:t xml:space="preserve">วิญญาณศิลา (สัตว์คู่หู):</w:t>
+      </w:r>
+      <w:r>
+        <w:rPr>
+          <w:rFonts w:ascii="Arial Unicode MS" w:cs="Arial Unicode MS" w:eastAsia="Arial Unicode MS" w:hAnsi="Arial Unicode MS"/>
+          <w:color w:val="1f1f1f"/>
+          <w:rtl w:val="0"/>
+        </w:rPr>
+        <w:t xml:space="preserve"> ดรอปจากบอส ใส่ได้ 3 ช่อง แต่ละตัวให้โบนัสติดตัว เช่น ของดรอปเพิ่ม ต้านไฟ ฟื้นมานา ตัวในช่องแรกเดินตามตัวละคร</w:t>
+      </w:r>
+    </w:p>
+    <w:p>
+      <w:pPr>
+        <w:numPr>
+          <w:ilvl w:val="0"/>
+          <w:numId w:val="12"/>
+        </w:numPr>
+        <w:pBdr>
+          <w:top w:color="auto" w:space="0" w:sz="0" w:val="none"/>
+          <w:bottom w:color="auto" w:space="0" w:sz="0" w:val="none"/>
+          <w:right w:color="auto" w:space="0" w:sz="0" w:val="none"/>
+          <w:between w:color="auto" w:space="0" w:sz="0" w:val="none"/>
+        </w:pBdr>
+        <w:spacing w:after="0" w:afterAutospacing="0" w:lineRule="auto"/>
+        <w:ind w:left="720" w:hanging="360"/>
+      </w:pPr>
+      <w:r>
+        <w:rPr>
+          <w:rFonts w:ascii="Arial Unicode MS" w:cs="Arial Unicode MS" w:eastAsia="Arial Unicode MS" w:hAnsi="Arial Unicode MS"/>
+          <w:b w:val="1"/>
+          <w:bCs w:val="1"/>
+          <w:color w:val="1f1f1f"/>
+          <w:rtl w:val="0"/>
+        </w:rPr>
+        <w:t xml:space="preserve">ผังแดนศิลา (endgame):</w:t>
+      </w:r>
+      <w:r>
+        <w:rPr>
+          <w:rFonts w:ascii="Arial Unicode MS" w:cs="Arial Unicode MS" w:eastAsia="Arial Unicode MS" w:hAnsi="Arial Unicode MS"/>
+          <w:color w:val="1f1f1f"/>
+          <w:rtl w:val="0"/>
+        </w:rPr>
+        <w:t xml:space="preserve"> ต่อยอดแผ่นศิลาเป็นแผนที่โหนดที่เลือกเส้นทางเอง เคลียร์ด่านแล้วปลดโหนดข้างๆ มีโหนดบอสและโหนดโบนัส แทนการมีประตูเดียว</w:t>
+      </w:r>
+    </w:p>
+    <w:p>
+      <w:pPr>
+        <w:numPr>
+          <w:ilvl w:val="0"/>
+          <w:numId w:val="12"/>
+        </w:numPr>
+        <w:pBdr>
+          <w:top w:color="auto" w:space="0" w:sz="0" w:val="none"/>
+          <w:bottom w:color="auto" w:space="0" w:sz="0" w:val="none"/>
+          <w:right w:color="auto" w:space="0" w:sz="0" w:val="none"/>
+          <w:between w:color="auto" w:space="0" w:sz="0" w:val="none"/>
+        </w:pBdr>
+        <w:spacing w:after="0" w:afterAutospacing="0" w:lineRule="auto"/>
+        <w:ind w:left="720" w:hanging="360"/>
+      </w:pPr>
+      <w:r>
+        <w:rPr>
+          <w:rFonts w:ascii="Arial Unicode MS" w:cs="Arial Unicode MS" w:eastAsia="Arial Unicode MS" w:hAnsi="Arial Unicode MS"/>
+          <w:b w:val="1"/>
+          <w:bCs w:val="1"/>
+          <w:color w:val="1f1f1f"/>
+          <w:rtl w:val="0"/>
+        </w:rPr>
+        <w:t xml:space="preserve">สกิลออร่า + พลังแกน:</w:t>
+      </w:r>
+      <w:r>
+        <w:rPr>
+          <w:rFonts w:ascii="Arial Unicode MS" w:cs="Arial Unicode MS" w:eastAsia="Arial Unicode MS" w:hAnsi="Arial Unicode MS"/>
+          <w:color w:val="1f1f1f"/>
+          <w:rtl w:val="0"/>
+        </w:rPr>
+        <w:t xml:space="preserve"> สกิลติดตัวที่จองค่าพลังแกน (แยกจากมานา) แลกกับบัฟถาวร เช่น ดาเมจไฟเพิ่ม ค่าต้านทานเพิ่ม</w:t>
+      </w:r>
+    </w:p>
+    <w:p>
+      <w:pPr>
+        <w:numPr>
+          <w:ilvl w:val="0"/>
+          <w:numId w:val="12"/>
+        </w:numPr>
+        <w:pBdr>
+          <w:top w:color="auto" w:space="0" w:sz="0" w:val="none"/>
+          <w:bottom w:color="auto" w:space="0" w:sz="0" w:val="none"/>
+          <w:right w:color="auto" w:space="0" w:sz="0" w:val="none"/>
+          <w:between w:color="auto" w:space="0" w:sz="0" w:val="none"/>
+        </w:pBdr>
+        <w:spacing w:after="0" w:afterAutospacing="0" w:lineRule="auto"/>
+        <w:ind w:left="720" w:hanging="360"/>
+      </w:pPr>
+      <w:r>
+        <w:rPr>
+          <w:rFonts w:ascii="Arial Unicode MS" w:cs="Arial Unicode MS" w:eastAsia="Arial Unicode MS" w:hAnsi="Arial Unicode MS"/>
+          <w:b w:val="1"/>
+          <w:bCs w:val="1"/>
+          <w:color w:val="1f1f1f"/>
+          <w:rtl w:val="0"/>
+        </w:rPr>
+        <w:t xml:space="preserve">สกิลทำงานเอง:</w:t>
+      </w:r>
+      <w:r>
+        <w:rPr>
+          <w:rFonts w:ascii="Arial Unicode MS" w:cs="Arial Unicode MS" w:eastAsia="Arial Unicode MS" w:hAnsi="Arial Unicode MS"/>
+          <w:color w:val="1f1f1f"/>
+          <w:rtl w:val="0"/>
+        </w:rPr>
+        <w:t xml:space="preserve"> รูนแบบใหม่ที่ทำให้สกิลใช้เองตอนกลิ้ง ตอนคริ หรือตอนฆ่า ทำหลังข้อสกิลเพิ่ม</w:t>
+      </w:r>
+    </w:p>
+    <w:p>
+      <w:pPr>
+        <w:numPr>
+          <w:ilvl w:val="0"/>
+          <w:numId w:val="12"/>
+        </w:numPr>
+        <w:pBdr>
+          <w:top w:color="auto" w:space="0" w:sz="0" w:val="none"/>
+          <w:bottom w:color="auto" w:space="0" w:sz="0" w:val="none"/>
+          <w:right w:color="auto" w:space="0" w:sz="0" w:val="none"/>
+          <w:between w:color="auto" w:space="0" w:sz="0" w:val="none"/>
+        </w:pBdr>
+        <w:spacing w:after="0" w:afterAutospacing="0" w:lineRule="auto"/>
+        <w:ind w:left="720" w:hanging="360"/>
+      </w:pPr>
+      <w:r>
+        <w:rPr>
+          <w:rFonts w:ascii="Arial Unicode MS" w:cs="Arial Unicode MS" w:eastAsia="Arial Unicode MS" w:hAnsi="Arial Unicode MS"/>
+          <w:b w:val="1"/>
+          <w:bCs w:val="1"/>
+          <w:color w:val="1f1f1f"/>
+          <w:rtl w:val="0"/>
+        </w:rPr>
+        <w:t xml:space="preserve">หินต้องสาป (คราฟต์เสี่ยงดวง):</w:t>
+      </w:r>
+      <w:r>
+        <w:rPr>
+          <w:rFonts w:ascii="Arial Unicode MS" w:cs="Arial Unicode MS" w:eastAsia="Arial Unicode MS" w:hAnsi="Arial Unicode MS"/>
+          <w:color w:val="1f1f1f"/>
+          <w:rtl w:val="0"/>
+        </w:rPr>
+        <w:t xml:space="preserve"> ใช้กับไอเทมแล้วสุ่มผลแรง อาจได้ affix พิเศษหรือค่าลดลง แล้วไอเทมถูกล็อก คราฟต์ต่อไม่ได้</w:t>
+      </w:r>
+    </w:p>
+    <w:p>
+      <w:pPr>
+        <w:numPr>
+          <w:ilvl w:val="0"/>
+          <w:numId w:val="12"/>
+        </w:numPr>
+        <w:pBdr>
+          <w:top w:color="auto" w:space="0" w:sz="0" w:val="none"/>
+          <w:bottom w:color="auto" w:space="0" w:sz="0" w:val="none"/>
+          <w:right w:color="auto" w:space="0" w:sz="0" w:val="none"/>
+          <w:between w:color="auto" w:space="0" w:sz="0" w:val="none"/>
+        </w:pBdr>
+        <w:spacing w:after="0" w:afterAutospacing="0" w:lineRule="auto"/>
+        <w:ind w:left="720" w:hanging="360"/>
+      </w:pPr>
+      <w:r>
+        <w:rPr>
+          <w:rFonts w:ascii="Arial Unicode MS" w:cs="Arial Unicode MS" w:eastAsia="Arial Unicode MS" w:hAnsi="Arial Unicode MS"/>
+          <w:b w:val="1"/>
+          <w:bCs w:val="1"/>
+          <w:color w:val="1f1f1f"/>
+          <w:rtl w:val="0"/>
+        </w:rPr>
         <w:t xml:space="preserve">ข้อควรระวัง:</w:t>
       </w:r>
       <w:r>
@@ -6328,7 +7079,7 @@
           <w:color w:val="1f1f1f"/>
           <w:rtl w:val="0"/>
         </w:rPr>
-        <w:t xml:space="preserve"> ใช้ระบบแนวเดียวกับ PoE ได้ แต่ห้ามใช้ชื่อของเขา (Orb, Waystone, Atlas, ชื่อเจม/คลาส) เลย์เอาต์ผังพาสซีฟ ภาพ เสียง หรือตารางตัวเลข ให้ตั้งชื่อตามธีมหินของเกมเรา</w:t>
+        <w:t xml:space="preserve"> ใช้ระบบแนวเดียวกับ PoE2 และ Torchlight Infinite ได้ แต่ห้ามใช้ชื่อของเขา (Orb, Waystone, Atlas, Spirit, Pactspirit, Netherrealm, Beacon, ชื่อเจม/คลาส/ฮีโร่) เลย์เอาต์ผังพาสซีฟ ภาพ เสียง หรือตารางตัวเลข ให้ตั้งชื่อตามธีมหินของเกมเรา</w:t>
       </w:r>
     </w:p>
     <w:p>

</xml_diff>